<commit_message>
Revert "Standardize D2/D3 docx formatting to match D1; add D4 docx"
This reverts commit 17d423efff76ccda71bc98f45ef8e30b1e560d59.
</commit_message>
<xml_diff>
--- a/deliverables/deliverable2/Group 4 AOS Report Deliverable 2.docx
+++ b/deliverables/deliverable2/Group 4 AOS Report Deliverable 2.docx
@@ -4,272 +4,981 @@
   <w:body>
     <w:p>
       <w:pPr>
+        <w:pStyle w:val="Heading1"/>
+        <w:shd w:val="clear" w:color="auto" w:fill="FFFFFF" w:themeFill="background1"/>
+        <w:spacing w:after="200" w:line="240" w:lineRule="auto"/>
         <w:jc w:val="center"/>
-      </w:pPr>
-    </w:p>
-    <w:p>
-      <w:pPr>
+        <w:rPr>
+          <w:sz w:val="44"/>
+          <w:szCs w:val="44"/>
+        </w:rPr>
+      </w:pPr>
+      <w:r>
+        <w:rPr>
+          <w:sz w:val="32"/>
+          <w:szCs w:val="32"/>
+        </w:rPr>
+        <w:t xml:space="preserve">Deliverable </w:t>
+      </w:r>
+      <w:r>
+        <w:rPr>
+          <w:sz w:val="32"/>
+          <w:szCs w:val="32"/>
+        </w:rPr>
+        <w:t>2</w:t>
+      </w:r>
+      <w:r>
+        <w:rPr>
+          <w:sz w:val="32"/>
+          <w:szCs w:val="32"/>
+        </w:rPr>
+        <w:t>: Process Scheduling </w:t>
+      </w:r>
+    </w:p>
+    <w:p>
+      <w:pPr>
+        <w:pStyle w:val="Heading1"/>
+        <w:shd w:val="clear" w:color="auto" w:fill="FFFFFF" w:themeFill="background1"/>
+        <w:spacing w:after="200" w:line="240" w:lineRule="auto"/>
+        <w:rPr>
+          <w:sz w:val="28"/>
+          <w:szCs w:val="28"/>
+        </w:rPr>
+      </w:pPr>
+    </w:p>
+    <w:p>
+      <w:pPr>
+        <w:pStyle w:val="Heading1"/>
+        <w:shd w:val="clear" w:color="auto" w:fill="FFFFFF" w:themeFill="background1"/>
+        <w:spacing w:after="200" w:line="240" w:lineRule="auto"/>
         <w:jc w:val="center"/>
-      </w:pPr>
-    </w:p>
-    <w:p>
-      <w:pPr>
+        <w:rPr>
+          <w:sz w:val="28"/>
+          <w:szCs w:val="28"/>
+        </w:rPr>
+      </w:pPr>
+      <w:r>
+        <w:rPr>
+          <w:sz w:val="28"/>
+          <w:szCs w:val="28"/>
+        </w:rPr>
+        <w:t>Group 4:</w:t>
+      </w:r>
+    </w:p>
+    <w:p>
+      <w:pPr>
+        <w:pStyle w:val="Heading1"/>
+        <w:shd w:val="clear" w:color="auto" w:fill="FFFFFF" w:themeFill="background1"/>
+        <w:spacing w:after="200" w:line="240" w:lineRule="auto"/>
         <w:jc w:val="center"/>
-      </w:pPr>
-      <w:r>
-        <w:t>Advanced Shell Simulation with Integrated OS Concepts</w:t>
-      </w:r>
-    </w:p>
-    <w:p>
-      <w:pPr>
+        <w:rPr>
+          <w:sz w:val="28"/>
+          <w:szCs w:val="28"/>
+        </w:rPr>
+      </w:pPr>
+      <w:r>
+        <w:rPr>
+          <w:sz w:val="28"/>
+          <w:szCs w:val="28"/>
+        </w:rPr>
+        <w:t>Abdul Rahim Aamir</w:t>
+      </w:r>
+    </w:p>
+    <w:p>
+      <w:pPr>
+        <w:pStyle w:val="Heading1"/>
+        <w:shd w:val="clear" w:color="auto" w:fill="FFFFFF" w:themeFill="background1"/>
+        <w:spacing w:after="200" w:line="240" w:lineRule="auto"/>
         <w:jc w:val="center"/>
-      </w:pPr>
-    </w:p>
-    <w:p>
-      <w:pPr>
+        <w:rPr>
+          <w:sz w:val="28"/>
+          <w:szCs w:val="28"/>
+        </w:rPr>
+      </w:pPr>
+      <w:r>
+        <w:rPr>
+          <w:sz w:val="28"/>
+          <w:szCs w:val="28"/>
+        </w:rPr>
+        <w:t xml:space="preserve">Ebubechukwu </w:t>
+      </w:r>
+      <w:proofErr w:type="spellStart"/>
+      <w:r>
+        <w:rPr>
+          <w:sz w:val="28"/>
+          <w:szCs w:val="28"/>
+        </w:rPr>
+        <w:t>Ohizu</w:t>
+      </w:r>
+      <w:proofErr w:type="spellEnd"/>
+    </w:p>
+    <w:p>
+      <w:pPr>
+        <w:pStyle w:val="Heading1"/>
+        <w:shd w:val="clear" w:color="auto" w:fill="FFFFFF" w:themeFill="background1"/>
+        <w:spacing w:after="200" w:line="240" w:lineRule="auto"/>
         <w:jc w:val="center"/>
-      </w:pPr>
-      <w:r>
-        <w:t>Group 4:</w:t>
-      </w:r>
-    </w:p>
-    <w:p>
-      <w:pPr>
+        <w:rPr>
+          <w:sz w:val="28"/>
+          <w:szCs w:val="28"/>
+        </w:rPr>
+      </w:pPr>
+      <w:r>
+        <w:rPr>
+          <w:sz w:val="28"/>
+          <w:szCs w:val="28"/>
+        </w:rPr>
+        <w:t>Gaurab Karki</w:t>
+      </w:r>
+    </w:p>
+    <w:p>
+      <w:pPr>
+        <w:pStyle w:val="Heading1"/>
+        <w:shd w:val="clear" w:color="auto" w:fill="FFFFFF" w:themeFill="background1"/>
+        <w:spacing w:after="200" w:line="240" w:lineRule="auto"/>
         <w:jc w:val="center"/>
-      </w:pPr>
-      <w:r>
-        <w:t>Abdul Rahim Aamir</w:t>
-      </w:r>
-    </w:p>
-    <w:p>
-      <w:pPr>
+        <w:rPr>
+          <w:sz w:val="28"/>
+          <w:szCs w:val="28"/>
+        </w:rPr>
+      </w:pPr>
+      <w:r>
+        <w:rPr>
+          <w:sz w:val="28"/>
+          <w:szCs w:val="28"/>
+        </w:rPr>
+        <w:t>Rajiv Agrawal</w:t>
+      </w:r>
+    </w:p>
+    <w:p>
+      <w:pPr>
+        <w:pStyle w:val="Heading1"/>
+        <w:shd w:val="clear" w:color="auto" w:fill="FFFFFF" w:themeFill="background1"/>
+        <w:spacing w:after="200" w:line="240" w:lineRule="auto"/>
         <w:jc w:val="center"/>
-      </w:pPr>
-      <w:r>
-        <w:t>Ebubechukwu Ohizu</w:t>
-      </w:r>
-    </w:p>
-    <w:p>
-      <w:pPr>
+        <w:rPr>
+          <w:sz w:val="28"/>
+          <w:szCs w:val="28"/>
+        </w:rPr>
+      </w:pPr>
+    </w:p>
+    <w:p>
+      <w:pPr>
+        <w:pStyle w:val="Heading1"/>
+        <w:shd w:val="clear" w:color="auto" w:fill="FFFFFF" w:themeFill="background1"/>
+        <w:spacing w:after="200" w:line="240" w:lineRule="auto"/>
         <w:jc w:val="center"/>
-      </w:pPr>
-      <w:r>
-        <w:t>Gaurab Karki</w:t>
-      </w:r>
-    </w:p>
-    <w:p>
-      <w:pPr>
+        <w:rPr>
+          <w:sz w:val="28"/>
+          <w:szCs w:val="28"/>
+        </w:rPr>
+      </w:pPr>
+      <w:r>
+        <w:rPr>
+          <w:sz w:val="28"/>
+          <w:szCs w:val="28"/>
+        </w:rPr>
+        <w:t xml:space="preserve">An assignment submitted in partial </w:t>
+      </w:r>
+      <w:proofErr w:type="spellStart"/>
+      <w:r>
+        <w:rPr>
+          <w:sz w:val="28"/>
+          <w:szCs w:val="28"/>
+        </w:rPr>
+        <w:t>fulfillment</w:t>
+      </w:r>
+      <w:proofErr w:type="spellEnd"/>
+      <w:r>
+        <w:rPr>
+          <w:sz w:val="28"/>
+          <w:szCs w:val="28"/>
+        </w:rPr>
+        <w:t xml:space="preserve"> of the requirements for MSCE-631 as part of</w:t>
+      </w:r>
+    </w:p>
+    <w:p>
+      <w:pPr>
+        <w:pStyle w:val="Heading1"/>
+        <w:shd w:val="clear" w:color="auto" w:fill="FFFFFF" w:themeFill="background1"/>
+        <w:spacing w:after="200" w:line="240" w:lineRule="auto"/>
         <w:jc w:val="center"/>
-      </w:pPr>
-      <w:r>
-        <w:t>Rajiv Agrawal</w:t>
-      </w:r>
-    </w:p>
-    <w:p>
-      <w:pPr>
+        <w:rPr>
+          <w:sz w:val="28"/>
+          <w:szCs w:val="28"/>
+        </w:rPr>
+      </w:pPr>
+    </w:p>
+    <w:p>
+      <w:pPr>
+        <w:pStyle w:val="Heading1"/>
+        <w:shd w:val="clear" w:color="auto" w:fill="FFFFFF" w:themeFill="background1"/>
+        <w:spacing w:after="200" w:line="240" w:lineRule="auto"/>
         <w:jc w:val="center"/>
-      </w:pPr>
-    </w:p>
-    <w:p>
-      <w:pPr>
+        <w:rPr>
+          <w:sz w:val="28"/>
+          <w:szCs w:val="28"/>
+        </w:rPr>
+      </w:pPr>
+      <w:r>
+        <w:rPr>
+          <w:sz w:val="28"/>
+          <w:szCs w:val="28"/>
+        </w:rPr>
+        <w:t>the degree, Master of Science</w:t>
+      </w:r>
+    </w:p>
+    <w:p>
+      <w:pPr>
+        <w:pStyle w:val="Heading1"/>
+        <w:shd w:val="clear" w:color="auto" w:fill="FFFFFF" w:themeFill="background1"/>
+        <w:spacing w:after="200" w:line="240" w:lineRule="auto"/>
         <w:jc w:val="center"/>
-      </w:pPr>
-      <w:r>
-        <w:t>An assignment submitted in partial fulfillment of the requirements for MSCE-631 as part of</w:t>
-      </w:r>
-    </w:p>
-    <w:p>
-      <w:pPr>
+        <w:rPr>
+          <w:sz w:val="28"/>
+          <w:szCs w:val="28"/>
+        </w:rPr>
+      </w:pPr>
+    </w:p>
+    <w:p>
+      <w:pPr>
+        <w:pStyle w:val="Heading1"/>
+        <w:shd w:val="clear" w:color="auto" w:fill="FFFFFF" w:themeFill="background1"/>
+        <w:spacing w:after="200" w:line="240" w:lineRule="auto"/>
         <w:jc w:val="center"/>
-      </w:pPr>
-      <w:r>
+        <w:rPr>
+          <w:sz w:val="28"/>
+          <w:szCs w:val="28"/>
+        </w:rPr>
+      </w:pPr>
+      <w:r>
+        <w:rPr>
+          <w:sz w:val="28"/>
+          <w:szCs w:val="28"/>
+        </w:rPr>
         <w:t>In</w:t>
       </w:r>
     </w:p>
     <w:p>
       <w:pPr>
+        <w:pStyle w:val="Heading1"/>
+        <w:shd w:val="clear" w:color="auto" w:fill="FFFFFF" w:themeFill="background1"/>
+        <w:spacing w:after="200" w:line="240" w:lineRule="auto"/>
         <w:jc w:val="center"/>
-      </w:pPr>
-      <w:r>
+        <w:rPr>
+          <w:sz w:val="28"/>
+          <w:szCs w:val="28"/>
+        </w:rPr>
+      </w:pPr>
+      <w:r>
+        <w:rPr>
+          <w:sz w:val="28"/>
+          <w:szCs w:val="28"/>
+        </w:rPr>
         <w:t>Cyber Engineering</w:t>
       </w:r>
     </w:p>
     <w:p>
       <w:pPr>
+        <w:pStyle w:val="Heading1"/>
+        <w:shd w:val="clear" w:color="auto" w:fill="FFFFFF" w:themeFill="background1"/>
+        <w:spacing w:after="200" w:line="240" w:lineRule="auto"/>
         <w:jc w:val="center"/>
-      </w:pPr>
-    </w:p>
-    <w:p>
-      <w:pPr>
+        <w:rPr>
+          <w:sz w:val="28"/>
+          <w:szCs w:val="28"/>
+        </w:rPr>
+      </w:pPr>
+    </w:p>
+    <w:p>
+      <w:pPr>
+        <w:pStyle w:val="Heading1"/>
+        <w:shd w:val="clear" w:color="auto" w:fill="FFFFFF" w:themeFill="background1"/>
+        <w:spacing w:after="200" w:line="240" w:lineRule="auto"/>
         <w:jc w:val="center"/>
-      </w:pPr>
-      <w:r>
+        <w:rPr>
+          <w:sz w:val="28"/>
+          <w:szCs w:val="28"/>
+        </w:rPr>
+      </w:pPr>
+      <w:r>
+        <w:rPr>
+          <w:sz w:val="28"/>
+          <w:szCs w:val="28"/>
+        </w:rPr>
         <w:t>School of Computing and Information Sciences</w:t>
       </w:r>
     </w:p>
     <w:p>
       <w:pPr>
+        <w:pStyle w:val="Heading1"/>
+        <w:shd w:val="clear" w:color="auto" w:fill="FFFFFF" w:themeFill="background1"/>
+        <w:spacing w:after="200" w:line="240" w:lineRule="auto"/>
         <w:jc w:val="center"/>
-      </w:pPr>
-      <w:r>
+        <w:rPr>
+          <w:sz w:val="28"/>
+          <w:szCs w:val="28"/>
+        </w:rPr>
+      </w:pPr>
+      <w:r>
+        <w:rPr>
+          <w:sz w:val="28"/>
+          <w:szCs w:val="28"/>
+        </w:rPr>
         <w:t>University of the Cumberlands</w:t>
       </w:r>
     </w:p>
     <w:p>
       <w:pPr>
+        <w:pStyle w:val="Heading1"/>
+        <w:shd w:val="clear" w:color="auto" w:fill="FFFFFF" w:themeFill="background1"/>
+        <w:spacing w:after="200" w:line="240" w:lineRule="auto"/>
         <w:jc w:val="center"/>
-      </w:pPr>
-      <w:r>
+        <w:rPr>
+          <w:sz w:val="28"/>
+          <w:szCs w:val="28"/>
+        </w:rPr>
+      </w:pPr>
+      <w:r>
+        <w:rPr>
+          <w:sz w:val="28"/>
+          <w:szCs w:val="28"/>
+        </w:rPr>
         <w:t>MSCE-630: Advanced Operating Systems</w:t>
       </w:r>
     </w:p>
     <w:p>
       <w:pPr>
+        <w:pStyle w:val="Heading1"/>
+        <w:shd w:val="clear" w:color="auto" w:fill="FFFFFF" w:themeFill="background1"/>
+        <w:spacing w:after="200" w:line="240" w:lineRule="auto"/>
         <w:jc w:val="center"/>
-      </w:pPr>
-      <w:r>
-        <w:t>Dr. Primus Vekuh</w:t>
-      </w:r>
-    </w:p>
-    <w:p>
-      <w:pPr>
+        <w:rPr>
+          <w:sz w:val="28"/>
+          <w:szCs w:val="28"/>
+        </w:rPr>
+      </w:pPr>
+    </w:p>
+    <w:p>
+      <w:pPr>
+        <w:pStyle w:val="Heading1"/>
+        <w:shd w:val="clear" w:color="auto" w:fill="FFFFFF" w:themeFill="background1"/>
+        <w:spacing w:after="200" w:line="240" w:lineRule="auto"/>
         <w:jc w:val="center"/>
-      </w:pPr>
-      <w:r>
+        <w:rPr>
+          <w:sz w:val="28"/>
+          <w:szCs w:val="28"/>
+        </w:rPr>
+      </w:pPr>
+      <w:r>
+        <w:rPr>
+          <w:sz w:val="28"/>
+          <w:szCs w:val="28"/>
+        </w:rPr>
+        <w:t xml:space="preserve">Dr. Primus </w:t>
+      </w:r>
+      <w:proofErr w:type="spellStart"/>
+      <w:r>
+        <w:rPr>
+          <w:sz w:val="28"/>
+          <w:szCs w:val="28"/>
+        </w:rPr>
+        <w:t>Vekuh</w:t>
+      </w:r>
+      <w:proofErr w:type="spellEnd"/>
+    </w:p>
+    <w:p>
+      <w:pPr>
+        <w:pStyle w:val="Heading1"/>
+        <w:shd w:val="clear" w:color="auto" w:fill="FFFFFF" w:themeFill="background1"/>
+        <w:spacing w:after="200" w:line="240" w:lineRule="auto"/>
+        <w:jc w:val="center"/>
+        <w:rPr>
+          <w:sz w:val="28"/>
+          <w:szCs w:val="28"/>
+        </w:rPr>
+      </w:pPr>
+      <w:r>
+        <w:rPr>
+          <w:sz w:val="28"/>
+          <w:szCs w:val="28"/>
+        </w:rPr>
         <w:t>March 28, 2026</w:t>
       </w:r>
     </w:p>
     <w:p>
       <w:pPr>
+        <w:pStyle w:val="Heading1"/>
+        <w:shd w:val="clear" w:color="auto" w:fill="FFFFFF" w:themeFill="background1"/>
+        <w:spacing w:after="200" w:line="240" w:lineRule="auto"/>
         <w:jc w:val="center"/>
-      </w:pPr>
-    </w:p>
-    <w:p>
-      <w:pPr>
+        <w:rPr>
+          <w:sz w:val="28"/>
+          <w:szCs w:val="28"/>
+        </w:rPr>
+      </w:pPr>
+    </w:p>
+    <w:p>
+      <w:pPr>
+        <w:pStyle w:val="Heading1"/>
+        <w:shd w:val="clear" w:color="auto" w:fill="FFFFFF" w:themeFill="background1"/>
+        <w:spacing w:after="200" w:line="240" w:lineRule="auto"/>
         <w:jc w:val="center"/>
-      </w:pPr>
-      <w:r>
+        <w:rPr>
+          <w:sz w:val="28"/>
+          <w:szCs w:val="28"/>
+        </w:rPr>
+      </w:pPr>
+      <w:r>
+        <w:rPr>
+          <w:sz w:val="28"/>
+          <w:szCs w:val="28"/>
+        </w:rPr>
         <w:t>Spring 2026</w:t>
       </w:r>
     </w:p>
     <w:p>
       <w:pPr>
+        <w:pStyle w:val="Heading1"/>
+        <w:shd w:val="clear" w:color="auto" w:fill="FFFFFF" w:themeFill="background1"/>
+        <w:spacing w:after="200"/>
         <w:jc w:val="center"/>
       </w:pPr>
     </w:p>
     <w:p>
-      <w:pPr/>
-      <w:r>
-        <w:br w:type="page"/>
-      </w:r>
-    </w:p>
-    <w:p>
-      <w:pPr>
-        <w:pStyle w:val="Strong1"/>
+      <w:pPr>
+        <w:pStyle w:val="Heading2"/>
+        <w:shd w:val="clear" w:color="auto" w:fill="FFFFFF" w:themeFill="background1"/>
+        <w:spacing w:after="200"/>
+        <w:rPr>
+          <w:sz w:val="28"/>
+          <w:szCs w:val="28"/>
+        </w:rPr>
+      </w:pPr>
+    </w:p>
+    <w:p>
+      <w:pPr>
+        <w:pStyle w:val="Heading2"/>
+        <w:shd w:val="clear" w:color="auto" w:fill="FFFFFF" w:themeFill="background1"/>
+        <w:spacing w:after="200"/>
         <w:jc w:val="center"/>
-      </w:pPr>
-      <w:r>
-        <w:t>Process Scheduling</w:t>
-      </w:r>
-    </w:p>
-    <w:p>
-      <w:pPr>
-        <w:pStyle w:val="Strong1"/>
-        <w:jc w:val="both"/>
-      </w:pPr>
-      <w:r>
+        <w:rPr>
+          <w:sz w:val="32"/>
+          <w:szCs w:val="32"/>
+        </w:rPr>
+      </w:pPr>
+      <w:r>
+        <w:rPr>
+          <w:sz w:val="32"/>
+          <w:szCs w:val="32"/>
+        </w:rPr>
+        <w:lastRenderedPageBreak/>
+        <w:t xml:space="preserve">Process Scheduling </w:t>
+      </w:r>
+    </w:p>
+    <w:p>
+      <w:pPr>
+        <w:pStyle w:val="Heading2"/>
+        <w:shd w:val="clear" w:color="auto" w:fill="FFFFFF" w:themeFill="background1"/>
+        <w:spacing w:after="200"/>
+        <w:rPr>
+          <w:sz w:val="28"/>
+          <w:szCs w:val="28"/>
+        </w:rPr>
+      </w:pPr>
+    </w:p>
+    <w:p>
+      <w:pPr>
+        <w:pStyle w:val="Heading2"/>
+        <w:shd w:val="clear" w:color="auto" w:fill="FFFFFF" w:themeFill="background1"/>
+        <w:spacing w:after="200"/>
+        <w:rPr>
+          <w:sz w:val="28"/>
+          <w:szCs w:val="28"/>
+        </w:rPr>
+      </w:pPr>
+      <w:r>
+        <w:rPr>
+          <w:sz w:val="28"/>
+          <w:szCs w:val="28"/>
+        </w:rPr>
         <w:t>1. Scheduling Algorithms</w:t>
       </w:r>
     </w:p>
     <w:p>
       <w:pPr>
-        <w:pStyle w:val="Strong1"/>
-        <w:jc w:val="both"/>
-      </w:pPr>
-      <w:r>
+        <w:pStyle w:val="Heading3"/>
+        <w:shd w:val="clear" w:color="auto" w:fill="FFFFFF" w:themeFill="background1"/>
+        <w:spacing w:after="200"/>
+        <w:rPr>
+          <w:sz w:val="24"/>
+          <w:szCs w:val="24"/>
+        </w:rPr>
+      </w:pPr>
+      <w:r>
+        <w:rPr>
+          <w:sz w:val="24"/>
+          <w:szCs w:val="24"/>
+        </w:rPr>
         <w:t>Round-Robin Scheduling</w:t>
       </w:r>
     </w:p>
     <w:p>
-      <w:pPr/>
-      <w:r>
-        <w:t>Round-Robin (RR) is implemented in RoundRobinScheduler inside shell/scheduler.py. Tasks are stored in a collections.deque. The scheduler works as follows:</w:t>
-      </w:r>
-    </w:p>
-    <w:p>
-      <w:pPr/>
-      <w:r>
-        <w:t>1. The user runs schedule rr &lt;quantum&gt; which sets the time quantum and instantiates the scheduler.</w:t>
-      </w:r>
-    </w:p>
-    <w:p>
-      <w:pPr/>
-      <w:r>
-        <w:t>2. Each add-task &lt;name&gt; &lt;burst&gt; &lt;priority&gt; call appends a Task dataclass to the deque.</w:t>
-      </w:r>
-    </w:p>
-    <w:p>
-      <w:pPr/>
-      <w:r>
-        <w:t>3. run-scheduler enters a loop that popleft()s the head task, runs it for min(quantum, remaining) simulated seconds using time.sleep(), and either marks it done or re-appends it to the tail if burst remains.</w:t>
-      </w:r>
-    </w:p>
-    <w:p>
-      <w:pPr/>
-      <w:r>
-        <w:t>4. The first time a task is picked up its start time is recorded for response-time calculation.</w:t>
-      </w:r>
-    </w:p>
-    <w:p>
-      <w:pPr/>
+      <w:pPr>
+        <w:shd w:val="clear" w:color="auto" w:fill="FFFFFF" w:themeFill="background1"/>
+        <w:spacing w:after="120"/>
+      </w:pPr>
+      <w:r>
+        <w:t>Round-Robin (RR) is implemented in</w:t>
+      </w:r>
+      <w:r>
+        <w:t xml:space="preserve"> round robin scheduler</w:t>
+      </w:r>
+      <w:r>
+        <w:t xml:space="preserve"> inside</w:t>
+      </w:r>
+      <w:r>
+        <w:t xml:space="preserve"> shell/scheduler.py</w:t>
+      </w:r>
+      <w:r>
+        <w:t xml:space="preserve"> Tasks are stored in a</w:t>
+      </w:r>
+      <w:r>
+        <w:t xml:space="preserve"> </w:t>
+      </w:r>
+      <w:proofErr w:type="spellStart"/>
+      <w:proofErr w:type="gramStart"/>
+      <w:r>
+        <w:t>collections.deque</w:t>
+      </w:r>
+      <w:proofErr w:type="spellEnd"/>
+      <w:proofErr w:type="gramEnd"/>
+      <w:r>
+        <w:t>. The scheduler works as follows:</w:t>
+      </w:r>
+    </w:p>
+    <w:p>
+      <w:pPr>
+        <w:shd w:val="clear" w:color="auto" w:fill="FFFFFF" w:themeFill="background1"/>
+        <w:spacing w:after="200"/>
+      </w:pPr>
+      <w:r>
+        <w:t xml:space="preserve"> </w:t>
+      </w:r>
+    </w:p>
+    <w:p>
+      <w:pPr>
+        <w:shd w:val="clear" w:color="auto" w:fill="FFFFFF" w:themeFill="background1"/>
+        <w:spacing w:after="100"/>
+        <w:ind w:left="20"/>
+      </w:pPr>
+      <w:r>
+        <w:t xml:space="preserve">1. The user runs </w:t>
+      </w:r>
+      <w:r>
+        <w:rPr>
+          <w:rFonts w:eastAsia="Courier New"/>
+        </w:rPr>
+        <w:t xml:space="preserve">schedule </w:t>
+      </w:r>
+      <w:proofErr w:type="spellStart"/>
+      <w:r>
+        <w:rPr>
+          <w:rFonts w:eastAsia="Courier New"/>
+        </w:rPr>
+        <w:t>rr</w:t>
+      </w:r>
+      <w:proofErr w:type="spellEnd"/>
+      <w:r>
+        <w:rPr>
+          <w:rFonts w:eastAsia="Courier New"/>
+        </w:rPr>
+        <w:t xml:space="preserve"> &lt;quantum&gt;</w:t>
+      </w:r>
+      <w:r>
+        <w:t xml:space="preserve"> which sets the time quantum and instantiates the scheduler.</w:t>
+      </w:r>
+    </w:p>
+    <w:p>
+      <w:pPr>
+        <w:shd w:val="clear" w:color="auto" w:fill="FFFFFF" w:themeFill="background1"/>
+        <w:spacing w:after="100"/>
+        <w:ind w:left="20"/>
+      </w:pPr>
+      <w:r>
+        <w:t xml:space="preserve">2. Each </w:t>
+      </w:r>
+      <w:r>
+        <w:rPr>
+          <w:rFonts w:ascii="Courier New" w:eastAsia="Courier New" w:hAnsi="Courier New" w:cs="Courier New"/>
+          <w:shd w:val="clear" w:color="auto" w:fill="FFFFFF" w:themeFill="background1"/>
+        </w:rPr>
+        <w:t>add-task &lt;name&gt; &lt;burst&gt; &lt;priority&gt;</w:t>
+      </w:r>
+      <w:r>
+        <w:t xml:space="preserve"> call appends a</w:t>
+      </w:r>
+      <w:r>
+        <w:rPr>
+          <w:shd w:val="clear" w:color="auto" w:fill="FFFFFF" w:themeFill="background1"/>
+        </w:rPr>
+        <w:t xml:space="preserve"> </w:t>
+      </w:r>
+      <w:r>
+        <w:rPr>
+          <w:rFonts w:ascii="Courier New" w:eastAsia="Courier New" w:hAnsi="Courier New" w:cs="Courier New"/>
+          <w:shd w:val="clear" w:color="auto" w:fill="FFFFFF" w:themeFill="background1"/>
+        </w:rPr>
+        <w:t>Task</w:t>
+      </w:r>
+      <w:r>
+        <w:rPr>
+          <w:shd w:val="clear" w:color="auto" w:fill="FFFFFF" w:themeFill="background1"/>
+        </w:rPr>
+        <w:t xml:space="preserve"> </w:t>
+      </w:r>
+      <w:proofErr w:type="spellStart"/>
+      <w:r>
+        <w:t>dataclass</w:t>
+      </w:r>
+      <w:proofErr w:type="spellEnd"/>
+      <w:r>
+        <w:t xml:space="preserve"> to the deque.</w:t>
+      </w:r>
+    </w:p>
+    <w:p>
+      <w:pPr>
+        <w:shd w:val="clear" w:color="auto" w:fill="FFFFFF" w:themeFill="background1"/>
+        <w:spacing w:after="100"/>
+        <w:ind w:left="20"/>
+      </w:pPr>
+      <w:r>
+        <w:t xml:space="preserve">3. </w:t>
+      </w:r>
+      <w:r>
+        <w:rPr>
+          <w:rFonts w:ascii="Courier New" w:eastAsia="Courier New" w:hAnsi="Courier New" w:cs="Courier New"/>
+          <w:shd w:val="clear" w:color="auto" w:fill="FFFFFF" w:themeFill="background1"/>
+        </w:rPr>
+        <w:t>run-scheduler</w:t>
+      </w:r>
+      <w:r>
+        <w:t xml:space="preserve"> enters a loop that </w:t>
+      </w:r>
+      <w:proofErr w:type="spellStart"/>
+      <w:proofErr w:type="gramStart"/>
+      <w:r>
+        <w:rPr>
+          <w:rFonts w:ascii="Courier New" w:eastAsia="Courier New" w:hAnsi="Courier New" w:cs="Courier New"/>
+          <w:shd w:val="clear" w:color="auto" w:fill="FFFFFF" w:themeFill="background1"/>
+        </w:rPr>
+        <w:t>popleft</w:t>
+      </w:r>
+      <w:proofErr w:type="spellEnd"/>
+      <w:r>
+        <w:rPr>
+          <w:rFonts w:ascii="Courier New" w:eastAsia="Courier New" w:hAnsi="Courier New" w:cs="Courier New"/>
+          <w:shd w:val="clear" w:color="auto" w:fill="FFFFFF" w:themeFill="background1"/>
+        </w:rPr>
+        <w:t>(</w:t>
+      </w:r>
+      <w:proofErr w:type="gramEnd"/>
+      <w:r>
+        <w:rPr>
+          <w:rFonts w:ascii="Courier New" w:eastAsia="Courier New" w:hAnsi="Courier New" w:cs="Courier New"/>
+          <w:shd w:val="clear" w:color="auto" w:fill="FFFFFF" w:themeFill="background1"/>
+        </w:rPr>
+        <w:t>)</w:t>
+      </w:r>
+      <w:r>
+        <w:t xml:space="preserve">s the head task, runs it for </w:t>
+      </w:r>
+      <w:proofErr w:type="gramStart"/>
+      <w:r>
+        <w:rPr>
+          <w:rFonts w:ascii="Courier New" w:eastAsia="Courier New" w:hAnsi="Courier New" w:cs="Courier New"/>
+          <w:shd w:val="clear" w:color="auto" w:fill="FFFFFF" w:themeFill="background1"/>
+        </w:rPr>
+        <w:t>min(</w:t>
+      </w:r>
+      <w:proofErr w:type="gramEnd"/>
+      <w:r>
+        <w:rPr>
+          <w:rFonts w:ascii="Courier New" w:eastAsia="Courier New" w:hAnsi="Courier New" w:cs="Courier New"/>
+          <w:shd w:val="clear" w:color="auto" w:fill="FFFFFF" w:themeFill="background1"/>
+        </w:rPr>
+        <w:t>quantum, remaining)</w:t>
+      </w:r>
+      <w:r>
+        <w:t xml:space="preserve"> simulated seconds using </w:t>
+      </w:r>
+      <w:proofErr w:type="spellStart"/>
+      <w:proofErr w:type="gramStart"/>
+      <w:r>
+        <w:rPr>
+          <w:rFonts w:ascii="Courier New" w:eastAsia="Courier New" w:hAnsi="Courier New" w:cs="Courier New"/>
+          <w:shd w:val="clear" w:color="auto" w:fill="FFFFFF" w:themeFill="background1"/>
+        </w:rPr>
+        <w:t>time.sleep</w:t>
+      </w:r>
+      <w:proofErr w:type="spellEnd"/>
+      <w:proofErr w:type="gramEnd"/>
+      <w:r>
+        <w:rPr>
+          <w:rFonts w:ascii="Courier New" w:eastAsia="Courier New" w:hAnsi="Courier New" w:cs="Courier New"/>
+          <w:shd w:val="clear" w:color="auto" w:fill="FFFFFF" w:themeFill="background1"/>
+        </w:rPr>
+        <w:t>()</w:t>
+      </w:r>
+      <w:r>
+        <w:rPr>
+          <w:shd w:val="clear" w:color="auto" w:fill="FFFFFF" w:themeFill="background1"/>
+        </w:rPr>
+        <w:t>,</w:t>
+      </w:r>
+      <w:r>
+        <w:t xml:space="preserve"> and either marks it done or re-appends it to the tail if burst remains.</w:t>
+      </w:r>
+    </w:p>
+    <w:p>
+      <w:pPr>
+        <w:shd w:val="clear" w:color="auto" w:fill="FFFFFF" w:themeFill="background1"/>
+        <w:spacing w:after="100"/>
+        <w:ind w:left="20"/>
+      </w:pPr>
+      <w:r>
+        <w:t xml:space="preserve">4. The first time a task is picked up its </w:t>
+      </w:r>
+      <w:r>
+        <w:rPr>
+          <w:rFonts w:ascii="Courier New" w:eastAsia="Courier New" w:hAnsi="Courier New" w:cs="Courier New"/>
+          <w:shd w:val="clear" w:color="auto" w:fill="FFFFFF" w:themeFill="background1"/>
+        </w:rPr>
+        <w:t>start</w:t>
+      </w:r>
+      <w:r>
+        <w:t xml:space="preserve"> time is recorded for response-time calculation.</w:t>
+      </w:r>
+    </w:p>
+    <w:p>
+      <w:pPr>
+        <w:shd w:val="clear" w:color="auto" w:fill="FFFFFF" w:themeFill="background1"/>
+        <w:spacing w:after="100"/>
+        <w:ind w:left="20"/>
+      </w:pPr>
       <w:r>
         <w:t>5. The loop exits when the deque is empty, then the metrics table is printed.</w:t>
       </w:r>
     </w:p>
     <w:p>
-      <w:pPr/>
-      <w:r>
-        <w:t>Context switching is modelled by the deque rotation — each incomplete task goes to the back after using its quantum, mimicking the preemptive quantum expiry of a real RR scheduler.</w:t>
-      </w:r>
-    </w:p>
-    <w:p>
-      <w:pPr/>
+      <w:pPr>
+        <w:shd w:val="clear" w:color="auto" w:fill="FFFFFF" w:themeFill="background1"/>
+        <w:spacing w:after="200"/>
+      </w:pPr>
       <w:r>
         <w:t xml:space="preserve"> </w:t>
       </w:r>
     </w:p>
     <w:p>
       <w:pPr>
-        <w:pStyle w:val="Strong1"/>
-        <w:jc w:val="both"/>
-      </w:pPr>
-      <w:r>
+        <w:shd w:val="clear" w:color="auto" w:fill="FFFFFF" w:themeFill="background1"/>
+        <w:spacing w:after="120"/>
+      </w:pPr>
+      <w:r>
+        <w:t xml:space="preserve">Context switching is modelled by the deque rotation — each incomplete task goes to the back after using its quantum, mimicking the </w:t>
+      </w:r>
+      <w:proofErr w:type="spellStart"/>
+      <w:r>
+        <w:t>preemptive</w:t>
+      </w:r>
+      <w:proofErr w:type="spellEnd"/>
+      <w:r>
+        <w:t xml:space="preserve"> quantum expiry of a real RR scheduler.</w:t>
+      </w:r>
+    </w:p>
+    <w:p>
+      <w:pPr>
+        <w:shd w:val="clear" w:color="auto" w:fill="FFFFFF" w:themeFill="background1"/>
+        <w:spacing w:after="200"/>
+      </w:pPr>
+      <w:r>
+        <w:t xml:space="preserve"> </w:t>
+      </w:r>
+    </w:p>
+    <w:p>
+      <w:pPr>
+        <w:pStyle w:val="Heading3"/>
+        <w:shd w:val="clear" w:color="auto" w:fill="FFFFFF" w:themeFill="background1"/>
+        <w:spacing w:after="200"/>
+        <w:rPr>
+          <w:sz w:val="28"/>
+          <w:szCs w:val="28"/>
+        </w:rPr>
+      </w:pPr>
+      <w:r>
+        <w:rPr>
+          <w:sz w:val="28"/>
+          <w:szCs w:val="28"/>
+        </w:rPr>
         <w:t>Priority-Based Scheduling</w:t>
       </w:r>
     </w:p>
     <w:p>
-      <w:pPr/>
-      <w:r>
-        <w:t>The PriorityScheduler uses Python's heapq module (a min-heap) ordered by (priority, arrival, name). Lower priority numbers indicate higher priority (1 = highest).</w:t>
-      </w:r>
-    </w:p>
-    <w:p>
-      <w:pPr/>
-      <w:r>
-        <w:t>Preemption mechanism:</w:t>
+      <w:pPr>
+        <w:shd w:val="clear" w:color="auto" w:fill="FFFFFF" w:themeFill="background1"/>
+        <w:spacing w:after="120"/>
+      </w:pPr>
+      <w:r>
+        <w:t xml:space="preserve">The </w:t>
+      </w:r>
+      <w:proofErr w:type="spellStart"/>
+      <w:r>
+        <w:rPr>
+          <w:rFonts w:ascii="Courier New" w:eastAsia="Courier New" w:hAnsi="Courier New" w:cs="Courier New"/>
+          <w:shd w:val="clear" w:color="auto" w:fill="FFFFFF" w:themeFill="background1"/>
+        </w:rPr>
+        <w:t>PriorityScheduler</w:t>
+      </w:r>
+      <w:proofErr w:type="spellEnd"/>
+      <w:r>
+        <w:rPr>
+          <w:shd w:val="clear" w:color="auto" w:fill="FFFFFF" w:themeFill="background1"/>
+        </w:rPr>
+        <w:t xml:space="preserve"> </w:t>
+      </w:r>
+      <w:r>
+        <w:t xml:space="preserve">uses Python's </w:t>
+      </w:r>
+      <w:proofErr w:type="spellStart"/>
+      <w:r>
+        <w:rPr>
+          <w:rFonts w:ascii="Courier New" w:eastAsia="Courier New" w:hAnsi="Courier New" w:cs="Courier New"/>
+          <w:shd w:val="clear" w:color="auto" w:fill="FFFFFF" w:themeFill="background1"/>
+        </w:rPr>
+        <w:t>heapq</w:t>
+      </w:r>
+      <w:proofErr w:type="spellEnd"/>
+      <w:r>
+        <w:rPr>
+          <w:shd w:val="clear" w:color="auto" w:fill="FFFFFF" w:themeFill="background1"/>
+        </w:rPr>
+        <w:t xml:space="preserve"> </w:t>
+      </w:r>
+      <w:r>
+        <w:t xml:space="preserve">module (a min-heap) ordered by </w:t>
+      </w:r>
+      <w:r>
+        <w:rPr>
+          <w:rFonts w:ascii="Courier New" w:eastAsia="Courier New" w:hAnsi="Courier New" w:cs="Courier New"/>
+          <w:shd w:val="clear" w:color="auto" w:fill="FFFFFF" w:themeFill="background1"/>
+        </w:rPr>
+        <w:t>(priority, arrival, name)</w:t>
+      </w:r>
+      <w:r>
+        <w:rPr>
+          <w:shd w:val="clear" w:color="auto" w:fill="FFFFFF" w:themeFill="background1"/>
+        </w:rPr>
+        <w:t>.</w:t>
+      </w:r>
+      <w:r>
+        <w:t xml:space="preserve"> Lower priority numbers indicate higher priority (1 = highest).</w:t>
+      </w:r>
+    </w:p>
+    <w:p>
+      <w:pPr>
+        <w:shd w:val="clear" w:color="auto" w:fill="FFFFFF" w:themeFill="background1"/>
+        <w:spacing w:after="200"/>
+      </w:pPr>
+      <w:r>
+        <w:t xml:space="preserve"> </w:t>
+      </w:r>
+    </w:p>
+    <w:p>
+      <w:pPr>
+        <w:shd w:val="clear" w:color="auto" w:fill="FFFFFF" w:themeFill="background1"/>
+        <w:spacing w:after="120"/>
+      </w:pPr>
+      <w:proofErr w:type="spellStart"/>
+      <w:r>
+        <w:rPr>
+          <w:b/>
+          <w:bCs/>
+        </w:rPr>
+        <w:t>Preemption</w:t>
+      </w:r>
+      <w:proofErr w:type="spellEnd"/>
+      <w:r>
+        <w:rPr>
+          <w:b/>
+          <w:bCs/>
+        </w:rPr>
+        <w:t xml:space="preserve"> mechanism:</w:t>
+      </w:r>
+    </w:p>
+    <w:p>
+      <w:pPr>
+        <w:shd w:val="clear" w:color="auto" w:fill="FFFFFF" w:themeFill="background1"/>
+        <w:spacing w:after="200"/>
+      </w:pPr>
+      <w:r>
+        <w:t xml:space="preserve"> </w:t>
       </w:r>
     </w:p>
     <w:p>
       <w:pPr>
         <w:pStyle w:val="ListParagraph"/>
-      </w:pPr>
-      <w:r>
-        <w:t>The scheduler runs the highest-priority task from the heap in 100 ms slices (time.sleep(0.1)).</w:t>
+        <w:numPr>
+          <w:ilvl w:val="0"/>
+          <w:numId w:val="2"/>
+        </w:numPr>
+        <w:shd w:val="clear" w:color="auto" w:fill="FFFFFF" w:themeFill="background1"/>
+        <w:spacing w:after="100"/>
+      </w:pPr>
+      <w:r>
+        <w:t xml:space="preserve">The scheduler runs the highest-priority task from the heap in 100 </w:t>
+      </w:r>
+      <w:proofErr w:type="spellStart"/>
+      <w:r>
+        <w:t>ms</w:t>
+      </w:r>
+      <w:proofErr w:type="spellEnd"/>
+      <w:r>
+        <w:t xml:space="preserve"> slices (</w:t>
+      </w:r>
+      <w:proofErr w:type="spellStart"/>
+      <w:proofErr w:type="gramStart"/>
+      <w:r>
+        <w:rPr>
+          <w:rFonts w:ascii="Courier New" w:eastAsia="Courier New" w:hAnsi="Courier New" w:cs="Courier New"/>
+          <w:shd w:val="clear" w:color="auto" w:fill="FFFFFF" w:themeFill="background1"/>
+        </w:rPr>
+        <w:t>time.sleep</w:t>
+      </w:r>
+      <w:proofErr w:type="spellEnd"/>
+      <w:proofErr w:type="gramEnd"/>
+      <w:r>
+        <w:rPr>
+          <w:rFonts w:ascii="Courier New" w:eastAsia="Courier New" w:hAnsi="Courier New" w:cs="Courier New"/>
+          <w:shd w:val="clear" w:color="auto" w:fill="FFFFFF" w:themeFill="background1"/>
+        </w:rPr>
+        <w:t>(0.1)</w:t>
+      </w:r>
+      <w:r>
+        <w:rPr>
+          <w:shd w:val="clear" w:color="auto" w:fill="FFFFFF" w:themeFill="background1"/>
+        </w:rPr>
+        <w:t>).</w:t>
       </w:r>
     </w:p>
     <w:p>
       <w:pPr>
         <w:pStyle w:val="ListParagraph"/>
+        <w:numPr>
+          <w:ilvl w:val="0"/>
+          <w:numId w:val="2"/>
+        </w:numPr>
+        <w:shd w:val="clear" w:color="auto" w:fill="FFFFFF" w:themeFill="background1"/>
+        <w:spacing w:after="100"/>
       </w:pPr>
       <w:r>
         <w:t>After each slice it checks whether a higher-priority task has been pushed onto the heap.</w:t>
@@ -278,118 +987,417 @@
     <w:p>
       <w:pPr>
         <w:pStyle w:val="ListParagraph"/>
-      </w:pPr>
-      <w:r>
-        <w:t>If one is found, a threading.Event (_preempt) is set, the loop breaks, the interrupted task's remaining burst is decremented, and it is pushed back onto the heap.</w:t>
+        <w:numPr>
+          <w:ilvl w:val="0"/>
+          <w:numId w:val="2"/>
+        </w:numPr>
+        <w:shd w:val="clear" w:color="auto" w:fill="FFFFFF" w:themeFill="background1"/>
+        <w:spacing w:after="100"/>
+      </w:pPr>
+      <w:r>
+        <w:t xml:space="preserve">If one is found, </w:t>
+      </w:r>
+      <w:r>
+        <w:rPr>
+          <w:shd w:val="clear" w:color="auto" w:fill="FFFFFF" w:themeFill="background1"/>
+        </w:rPr>
+        <w:t xml:space="preserve">a </w:t>
+      </w:r>
+      <w:proofErr w:type="spellStart"/>
+      <w:proofErr w:type="gramStart"/>
+      <w:r>
+        <w:rPr>
+          <w:rFonts w:ascii="Courier New" w:eastAsia="Courier New" w:hAnsi="Courier New" w:cs="Courier New"/>
+          <w:shd w:val="clear" w:color="auto" w:fill="FFFFFF" w:themeFill="background1"/>
+        </w:rPr>
+        <w:t>threading.Event</w:t>
+      </w:r>
+      <w:proofErr w:type="spellEnd"/>
+      <w:proofErr w:type="gramEnd"/>
+      <w:r>
+        <w:rPr>
+          <w:shd w:val="clear" w:color="auto" w:fill="FFFFFF" w:themeFill="background1"/>
+        </w:rPr>
+        <w:t xml:space="preserve"> (</w:t>
+      </w:r>
+      <w:r>
+        <w:rPr>
+          <w:rFonts w:ascii="Courier New" w:eastAsia="Courier New" w:hAnsi="Courier New" w:cs="Courier New"/>
+          <w:shd w:val="clear" w:color="auto" w:fill="FFFFFF" w:themeFill="background1"/>
+        </w:rPr>
+        <w:t>_</w:t>
+      </w:r>
+      <w:proofErr w:type="spellStart"/>
+      <w:r>
+        <w:rPr>
+          <w:rFonts w:ascii="Courier New" w:eastAsia="Courier New" w:hAnsi="Courier New" w:cs="Courier New"/>
+          <w:shd w:val="clear" w:color="auto" w:fill="FFFFFF" w:themeFill="background1"/>
+        </w:rPr>
+        <w:t>preempt</w:t>
+      </w:r>
+      <w:proofErr w:type="spellEnd"/>
+      <w:r>
+        <w:t xml:space="preserve">) is set, the loop breaks, the interrupted task's </w:t>
+      </w:r>
+      <w:r>
+        <w:rPr>
+          <w:rFonts w:eastAsia="Courier New"/>
+          <w:shd w:val="clear" w:color="auto" w:fill="FFFFFF" w:themeFill="background1"/>
+        </w:rPr>
+        <w:t>remaining</w:t>
+      </w:r>
+      <w:r>
+        <w:rPr>
+          <w:shd w:val="clear" w:color="auto" w:fill="FFFFFF" w:themeFill="background1"/>
+        </w:rPr>
+        <w:t xml:space="preserve"> </w:t>
+      </w:r>
+      <w:r>
+        <w:t>burst is decremented, and it is pushed back onto the heap.</w:t>
       </w:r>
     </w:p>
     <w:p>
       <w:pPr>
         <w:pStyle w:val="ListParagraph"/>
-      </w:pPr>
-      <w:r>
+        <w:numPr>
+          <w:ilvl w:val="0"/>
+          <w:numId w:val="2"/>
+        </w:numPr>
+        <w:shd w:val="clear" w:color="auto" w:fill="FFFFFF" w:themeFill="background1"/>
+        <w:spacing w:after="100"/>
+      </w:pPr>
+      <w:r>
+        <w:lastRenderedPageBreak/>
         <w:t>The new higher-priority task is then popped and begins executing.</w:t>
       </w:r>
     </w:p>
     <w:p>
-      <w:pPr/>
-      <w:r>
-        <w:t>This gives true preemptive behaviour: a late-arriving high-priority task can interrupt a lower-priority one mid-execution.</w:t>
-      </w:r>
-    </w:p>
-    <w:p>
-      <w:pPr/>
-      <w:r>
-        <w:t>Tie-breaking: Tasks with equal priority are ordered by arrival time (FCFS). If arrival times also match, names are compared lexicographically.</w:t>
-      </w:r>
-    </w:p>
-    <w:p>
-      <w:pPr/>
+      <w:pPr>
+        <w:shd w:val="clear" w:color="auto" w:fill="FFFFFF" w:themeFill="background1"/>
+        <w:spacing w:after="200"/>
+      </w:pPr>
       <w:r>
         <w:t xml:space="preserve"> </w:t>
       </w:r>
     </w:p>
     <w:p>
       <w:pPr>
-        <w:pStyle w:val="Strong1"/>
-        <w:jc w:val="both"/>
-      </w:pPr>
-      <w:r>
+        <w:shd w:val="clear" w:color="auto" w:fill="FFFFFF" w:themeFill="background1"/>
+        <w:spacing w:after="120"/>
+      </w:pPr>
+      <w:r>
+        <w:t xml:space="preserve">This gives true </w:t>
+      </w:r>
+      <w:proofErr w:type="spellStart"/>
+      <w:r>
+        <w:t>preemptive</w:t>
+      </w:r>
+      <w:proofErr w:type="spellEnd"/>
+      <w:r>
+        <w:t xml:space="preserve"> behaviour: a late-arriving high-priority task can interrupt a lower-priority one mid-execution.</w:t>
+      </w:r>
+    </w:p>
+    <w:p>
+      <w:pPr>
+        <w:shd w:val="clear" w:color="auto" w:fill="FFFFFF" w:themeFill="background1"/>
+        <w:spacing w:after="200"/>
+      </w:pPr>
+      <w:r>
+        <w:t xml:space="preserve"> </w:t>
+      </w:r>
+      <w:r>
+        <w:rPr>
+          <w:b/>
+          <w:bCs/>
+        </w:rPr>
+        <w:t>Tie-breaking:</w:t>
+      </w:r>
+      <w:r>
+        <w:t xml:space="preserve"> Tasks with equal priority are ordered by arrival time (FCFS). If arrival times also match, names are compared lexicographically.</w:t>
+      </w:r>
+    </w:p>
+    <w:p>
+      <w:pPr>
+        <w:shd w:val="clear" w:color="auto" w:fill="FFFFFF" w:themeFill="background1"/>
+        <w:spacing w:after="200"/>
+      </w:pPr>
+      <w:r>
+        <w:t xml:space="preserve"> </w:t>
+      </w:r>
+    </w:p>
+    <w:p>
+      <w:pPr>
+        <w:shd w:val="clear" w:color="auto" w:fill="FFFFFF" w:themeFill="background1"/>
+        <w:spacing w:after="200"/>
+      </w:pPr>
+      <w:r>
+        <w:t xml:space="preserve"> </w:t>
+      </w:r>
+    </w:p>
+    <w:p>
+      <w:pPr>
+        <w:pStyle w:val="Heading2"/>
+        <w:shd w:val="clear" w:color="auto" w:fill="FFFFFF" w:themeFill="background1"/>
+        <w:spacing w:after="200"/>
+        <w:rPr>
+          <w:sz w:val="28"/>
+          <w:szCs w:val="28"/>
+        </w:rPr>
+      </w:pPr>
+      <w:r>
+        <w:rPr>
+          <w:sz w:val="28"/>
+          <w:szCs w:val="28"/>
+        </w:rPr>
         <w:t>2. Performance Analysis</w:t>
       </w:r>
     </w:p>
     <w:p>
       <w:pPr>
-        <w:pStyle w:val="Strong1"/>
-        <w:jc w:val="both"/>
-      </w:pPr>
-      <w:r>
+        <w:pStyle w:val="Heading3"/>
+        <w:shd w:val="clear" w:color="auto" w:fill="FFFFFF" w:themeFill="background1"/>
+        <w:spacing w:after="200"/>
+      </w:pPr>
+      <w:r>
+        <w:rPr>
+          <w:sz w:val="24"/>
+          <w:szCs w:val="24"/>
+        </w:rPr>
         <w:t>Round-Robin Sample Run (quantum = 2s)</w:t>
       </w:r>
     </w:p>
     <w:p>
-      <w:pPr/>
+      <w:pPr>
+        <w:shd w:val="clear" w:color="auto" w:fill="FFFFFF" w:themeFill="background1"/>
+        <w:spacing w:after="120"/>
+      </w:pPr>
       <w:r>
         <w:t>Commands used:</w:t>
       </w:r>
     </w:p>
     <w:p>
-      <w:pPr/>
-      <w:r>
-        <w:rPr>
-          <w:rFonts w:ascii="Courier New" w:hAnsi="Courier New"/>
-          <w:sz w:val="18"/>
-        </w:rPr>
-        <w:t>schedule rr 2</w:t>
+      <w:pPr>
+        <w:shd w:val="clear" w:color="auto" w:fill="FFFFFF" w:themeFill="background1"/>
+        <w:spacing w:before="160" w:after="200"/>
+        <w:ind w:left="240" w:right="240"/>
+        <w:rPr>
+          <w:color w:val="000000" w:themeColor="text1"/>
+        </w:rPr>
+      </w:pPr>
+      <w:r>
+        <w:rPr>
+          <w:rFonts w:ascii="Courier New" w:eastAsia="Courier New" w:hAnsi="Courier New" w:cs="Courier New"/>
+          <w:color w:val="000000" w:themeColor="text1"/>
+          <w:sz w:val="20"/>
+          <w:szCs w:val="20"/>
+        </w:rPr>
+        <w:t xml:space="preserve">         </w:t>
+      </w:r>
+      <w:r>
+        <w:rPr>
+          <w:color w:val="000000" w:themeColor="text1"/>
+        </w:rPr>
         <w:br/>
-        <w:t>add-task TaskA 6 1</w:t>
+      </w:r>
+      <w:r>
+        <w:rPr>
+          <w:rFonts w:ascii="Courier New" w:eastAsia="Courier New" w:hAnsi="Courier New" w:cs="Courier New"/>
+          <w:color w:val="000000" w:themeColor="text1"/>
+          <w:sz w:val="20"/>
+          <w:szCs w:val="20"/>
+        </w:rPr>
+        <w:t xml:space="preserve">    schedule </w:t>
+      </w:r>
+      <w:proofErr w:type="spellStart"/>
+      <w:r>
+        <w:rPr>
+          <w:rFonts w:ascii="Courier New" w:eastAsia="Courier New" w:hAnsi="Courier New" w:cs="Courier New"/>
+          <w:color w:val="000000" w:themeColor="text1"/>
+          <w:sz w:val="20"/>
+          <w:szCs w:val="20"/>
+        </w:rPr>
+        <w:t>rr</w:t>
+      </w:r>
+      <w:proofErr w:type="spellEnd"/>
+      <w:r>
+        <w:rPr>
+          <w:rFonts w:ascii="Courier New" w:eastAsia="Courier New" w:hAnsi="Courier New" w:cs="Courier New"/>
+          <w:color w:val="000000" w:themeColor="text1"/>
+          <w:sz w:val="20"/>
+          <w:szCs w:val="20"/>
+        </w:rPr>
+        <w:t xml:space="preserve"> 2    </w:t>
+      </w:r>
+      <w:r>
+        <w:rPr>
+          <w:color w:val="000000" w:themeColor="text1"/>
+        </w:rPr>
         <w:br/>
-        <w:t>add-task TaskB 4 2</w:t>
+      </w:r>
+      <w:r>
+        <w:rPr>
+          <w:rFonts w:ascii="Courier New" w:eastAsia="Courier New" w:hAnsi="Courier New" w:cs="Courier New"/>
+          <w:color w:val="000000" w:themeColor="text1"/>
+          <w:sz w:val="20"/>
+          <w:szCs w:val="20"/>
+        </w:rPr>
+        <w:t xml:space="preserve">    add-task TaskA 6 1    </w:t>
+      </w:r>
+      <w:r>
+        <w:rPr>
+          <w:color w:val="000000" w:themeColor="text1"/>
+        </w:rPr>
         <w:br/>
-        <w:t>add-task TaskC 8 1</w:t>
+      </w:r>
+      <w:r>
+        <w:rPr>
+          <w:rFonts w:ascii="Courier New" w:eastAsia="Courier New" w:hAnsi="Courier New" w:cs="Courier New"/>
+          <w:color w:val="000000" w:themeColor="text1"/>
+          <w:sz w:val="20"/>
+          <w:szCs w:val="20"/>
+        </w:rPr>
+        <w:t xml:space="preserve">    add-task TaskB 4 2    </w:t>
+      </w:r>
+      <w:r>
+        <w:rPr>
+          <w:color w:val="000000" w:themeColor="text1"/>
+        </w:rPr>
         <w:br/>
-        <w:t>run-scheduler</w:t>
-      </w:r>
-    </w:p>
-    <w:p>
-      <w:pPr/>
+      </w:r>
+      <w:r>
+        <w:rPr>
+          <w:rFonts w:ascii="Courier New" w:eastAsia="Courier New" w:hAnsi="Courier New" w:cs="Courier New"/>
+          <w:color w:val="000000" w:themeColor="text1"/>
+          <w:sz w:val="20"/>
+          <w:szCs w:val="20"/>
+        </w:rPr>
+        <w:t xml:space="preserve">    add-task </w:t>
+      </w:r>
+      <w:proofErr w:type="spellStart"/>
+      <w:r>
+        <w:rPr>
+          <w:rFonts w:ascii="Courier New" w:eastAsia="Courier New" w:hAnsi="Courier New" w:cs="Courier New"/>
+          <w:color w:val="000000" w:themeColor="text1"/>
+          <w:sz w:val="20"/>
+          <w:szCs w:val="20"/>
+        </w:rPr>
+        <w:t>TaskC</w:t>
+      </w:r>
+      <w:proofErr w:type="spellEnd"/>
+      <w:r>
+        <w:rPr>
+          <w:rFonts w:ascii="Courier New" w:eastAsia="Courier New" w:hAnsi="Courier New" w:cs="Courier New"/>
+          <w:color w:val="000000" w:themeColor="text1"/>
+          <w:sz w:val="20"/>
+          <w:szCs w:val="20"/>
+        </w:rPr>
+        <w:t xml:space="preserve"> 8 1    </w:t>
+      </w:r>
+      <w:r>
+        <w:rPr>
+          <w:color w:val="000000" w:themeColor="text1"/>
+        </w:rPr>
+        <w:br/>
+      </w:r>
+      <w:r>
+        <w:rPr>
+          <w:rFonts w:ascii="Courier New" w:eastAsia="Courier New" w:hAnsi="Courier New" w:cs="Courier New"/>
+          <w:color w:val="000000" w:themeColor="text1"/>
+          <w:sz w:val="20"/>
+          <w:szCs w:val="20"/>
+        </w:rPr>
+        <w:t xml:space="preserve">    run-scheduler    </w:t>
+      </w:r>
+      <w:r>
+        <w:rPr>
+          <w:color w:val="000000" w:themeColor="text1"/>
+        </w:rPr>
+        <w:br/>
+      </w:r>
+      <w:r>
+        <w:rPr>
+          <w:rFonts w:ascii="Courier New" w:eastAsia="Courier New" w:hAnsi="Courier New" w:cs="Courier New"/>
+          <w:color w:val="000000" w:themeColor="text1"/>
+          <w:sz w:val="20"/>
+          <w:szCs w:val="20"/>
+        </w:rPr>
+        <w:t xml:space="preserve">         </w:t>
+      </w:r>
+    </w:p>
+    <w:p>
+      <w:pPr>
+        <w:shd w:val="clear" w:color="auto" w:fill="FFFFFF" w:themeFill="background1"/>
+        <w:spacing w:after="200"/>
+      </w:pPr>
+      <w:r>
+        <w:t xml:space="preserve"> </w:t>
+      </w:r>
+    </w:p>
+    <w:p>
+      <w:pPr>
+        <w:shd w:val="clear" w:color="auto" w:fill="FFFFFF" w:themeFill="background1"/>
+        <w:spacing w:after="120"/>
+      </w:pPr>
       <w:r>
         <w:t>Sample metrics output:</w:t>
+      </w:r>
+    </w:p>
+    <w:p>
+      <w:pPr>
+        <w:shd w:val="clear" w:color="auto" w:fill="FFFFFF" w:themeFill="background1"/>
+        <w:spacing w:after="200"/>
+      </w:pPr>
+      <w:r>
+        <w:t xml:space="preserve"> </w:t>
       </w:r>
     </w:p>
     <w:tbl>
       <w:tblPr>
-        <w:tblW w:type="auto" w:w="0"/>
-        <w:tblLook w:firstColumn="1" w:firstRow="1" w:lastColumn="0" w:lastRow="0" w:noHBand="0" w:noVBand="1" w:val="04A0"/>
+        <w:tblW w:w="5000" w:type="pct"/>
         <w:tblBorders>
-          <w:top w:val="single" w:sz="4" w:space="0" w:color="000000"/>
-          <w:left w:val="single" w:sz="4" w:space="0" w:color="000000"/>
-          <w:bottom w:val="single" w:sz="4" w:space="0" w:color="000000"/>
-          <w:right w:val="single" w:sz="4" w:space="0" w:color="000000"/>
-          <w:insideH w:val="single" w:sz="4" w:space="0" w:color="000000"/>
-          <w:insideV w:val="single" w:sz="4" w:space="0" w:color="000000"/>
+          <w:top w:val="single" w:sz="4" w:space="0" w:color="auto"/>
+          <w:left w:val="single" w:sz="4" w:space="0" w:color="auto"/>
+          <w:bottom w:val="single" w:sz="4" w:space="0" w:color="auto"/>
+          <w:right w:val="single" w:sz="4" w:space="0" w:color="auto"/>
+          <w:insideH w:val="single" w:sz="4" w:space="0" w:color="auto"/>
+          <w:insideV w:val="single" w:sz="4" w:space="0" w:color="auto"/>
         </w:tblBorders>
+        <w:tblLayout w:type="fixed"/>
+        <w:tblCellMar>
+          <w:top w:w="80" w:type="dxa"/>
+          <w:left w:w="120" w:type="dxa"/>
+          <w:bottom w:w="80" w:type="dxa"/>
+          <w:right w:w="120" w:type="dxa"/>
+        </w:tblCellMar>
+        <w:tblLook w:val="04A0" w:firstRow="1" w:lastRow="0" w:firstColumn="1" w:lastColumn="0" w:noHBand="0" w:noVBand="1"/>
       </w:tblPr>
       <w:tblGrid>
-        <w:gridCol w:w="1003"/>
-        <w:gridCol w:w="1003"/>
-        <w:gridCol w:w="1003"/>
-        <w:gridCol w:w="1003"/>
-        <w:gridCol w:w="1003"/>
-        <w:gridCol w:w="1003"/>
-        <w:gridCol w:w="1003"/>
-        <w:gridCol w:w="1003"/>
-        <w:gridCol w:w="1003"/>
+        <w:gridCol w:w="894"/>
+        <w:gridCol w:w="894"/>
+        <w:gridCol w:w="698"/>
+        <w:gridCol w:w="1088"/>
+        <w:gridCol w:w="893"/>
+        <w:gridCol w:w="991"/>
+        <w:gridCol w:w="1088"/>
+        <w:gridCol w:w="1284"/>
+        <w:gridCol w:w="1186"/>
       </w:tblGrid>
       <w:tr>
+        <w:trPr>
+          <w:tblHeader/>
+        </w:trPr>
         <w:tc>
           <w:tcPr>
-            <w:tcW w:type="dxa" w:w="1003"/>
+            <w:tcW w:w="926" w:type="dxa"/>
           </w:tcPr>
           <w:p>
+            <w:pPr>
+              <w:shd w:val="clear" w:color="auto" w:fill="FFFFFF" w:themeFill="background1"/>
+            </w:pPr>
             <w:r>
               <w:rPr>
                 <w:b/>
+                <w:bCs/>
               </w:rPr>
               <w:t>Task</w:t>
             </w:r>
@@ -397,12 +1405,16 @@
         </w:tc>
         <w:tc>
           <w:tcPr>
-            <w:tcW w:type="dxa" w:w="1003"/>
+            <w:tcW w:w="926" w:type="dxa"/>
           </w:tcPr>
           <w:p>
+            <w:pPr>
+              <w:shd w:val="clear" w:color="auto" w:fill="FFFFFF" w:themeFill="background1"/>
+            </w:pPr>
             <w:r>
               <w:rPr>
                 <w:b/>
+                <w:bCs/>
               </w:rPr>
               <w:t>Burst</w:t>
             </w:r>
@@ -410,12 +1422,16 @@
         </w:tc>
         <w:tc>
           <w:tcPr>
-            <w:tcW w:type="dxa" w:w="1003"/>
+            <w:tcW w:w="720" w:type="dxa"/>
           </w:tcPr>
           <w:p>
+            <w:pPr>
+              <w:shd w:val="clear" w:color="auto" w:fill="FFFFFF" w:themeFill="background1"/>
+            </w:pPr>
             <w:r>
               <w:rPr>
                 <w:b/>
+                <w:bCs/>
               </w:rPr>
               <w:t>Pri</w:t>
             </w:r>
@@ -423,12 +1439,16 @@
         </w:tc>
         <w:tc>
           <w:tcPr>
-            <w:tcW w:type="dxa" w:w="1003"/>
+            <w:tcW w:w="1131" w:type="dxa"/>
           </w:tcPr>
           <w:p>
+            <w:pPr>
+              <w:shd w:val="clear" w:color="auto" w:fill="FFFFFF" w:themeFill="background1"/>
+            </w:pPr>
             <w:r>
               <w:rPr>
                 <w:b/>
+                <w:bCs/>
               </w:rPr>
               <w:t>Arrival</w:t>
             </w:r>
@@ -436,12 +1456,16 @@
         </w:tc>
         <w:tc>
           <w:tcPr>
-            <w:tcW w:type="dxa" w:w="1003"/>
+            <w:tcW w:w="926" w:type="dxa"/>
           </w:tcPr>
           <w:p>
+            <w:pPr>
+              <w:shd w:val="clear" w:color="auto" w:fill="FFFFFF" w:themeFill="background1"/>
+            </w:pPr>
             <w:r>
               <w:rPr>
                 <w:b/>
+                <w:bCs/>
               </w:rPr>
               <w:t>Start</w:t>
             </w:r>
@@ -449,12 +1473,16 @@
         </w:tc>
         <w:tc>
           <w:tcPr>
-            <w:tcW w:type="dxa" w:w="1003"/>
+            <w:tcW w:w="1029" w:type="dxa"/>
           </w:tcPr>
           <w:p>
+            <w:pPr>
+              <w:shd w:val="clear" w:color="auto" w:fill="FFFFFF" w:themeFill="background1"/>
+            </w:pPr>
             <w:r>
               <w:rPr>
                 <w:b/>
+                <w:bCs/>
               </w:rPr>
               <w:t>Finish</w:t>
             </w:r>
@@ -462,12 +1490,16 @@
         </w:tc>
         <w:tc>
           <w:tcPr>
-            <w:tcW w:type="dxa" w:w="1003"/>
+            <w:tcW w:w="1131" w:type="dxa"/>
           </w:tcPr>
           <w:p>
+            <w:pPr>
+              <w:shd w:val="clear" w:color="auto" w:fill="FFFFFF" w:themeFill="background1"/>
+            </w:pPr>
             <w:r>
               <w:rPr>
                 <w:b/>
+                <w:bCs/>
               </w:rPr>
               <w:t>Waiting</w:t>
             </w:r>
@@ -475,12 +1507,16 @@
         </w:tc>
         <w:tc>
           <w:tcPr>
-            <w:tcW w:type="dxa" w:w="1003"/>
+            <w:tcW w:w="1337" w:type="dxa"/>
           </w:tcPr>
           <w:p>
+            <w:pPr>
+              <w:shd w:val="clear" w:color="auto" w:fill="FFFFFF" w:themeFill="background1"/>
+            </w:pPr>
             <w:r>
               <w:rPr>
                 <w:b/>
+                <w:bCs/>
               </w:rPr>
               <w:t>Turnaround</w:t>
             </w:r>
@@ -488,12 +1524,16 @@
         </w:tc>
         <w:tc>
           <w:tcPr>
-            <w:tcW w:type="dxa" w:w="1003"/>
+            <w:tcW w:w="1234" w:type="dxa"/>
           </w:tcPr>
           <w:p>
+            <w:pPr>
+              <w:shd w:val="clear" w:color="auto" w:fill="FFFFFF" w:themeFill="background1"/>
+            </w:pPr>
             <w:r>
               <w:rPr>
                 <w:b/>
+                <w:bCs/>
               </w:rPr>
               <w:t>Response</w:t>
             </w:r>
@@ -503,9 +1543,12 @@
       <w:tr>
         <w:tc>
           <w:tcPr>
-            <w:tcW w:type="dxa" w:w="1003"/>
+            <w:tcW w:w="926" w:type="dxa"/>
           </w:tcPr>
           <w:p>
+            <w:pPr>
+              <w:shd w:val="clear" w:color="auto" w:fill="FFFFFF" w:themeFill="background1"/>
+            </w:pPr>
             <w:r>
               <w:t>TaskA</w:t>
             </w:r>
@@ -513,9 +1556,12 @@
         </w:tc>
         <w:tc>
           <w:tcPr>
-            <w:tcW w:type="dxa" w:w="1003"/>
+            <w:tcW w:w="926" w:type="dxa"/>
           </w:tcPr>
           <w:p>
+            <w:pPr>
+              <w:shd w:val="clear" w:color="auto" w:fill="FFFFFF" w:themeFill="background1"/>
+            </w:pPr>
             <w:r>
               <w:t>6.00</w:t>
             </w:r>
@@ -523,9 +1569,12 @@
         </w:tc>
         <w:tc>
           <w:tcPr>
-            <w:tcW w:type="dxa" w:w="1003"/>
+            <w:tcW w:w="720" w:type="dxa"/>
           </w:tcPr>
           <w:p>
+            <w:pPr>
+              <w:shd w:val="clear" w:color="auto" w:fill="FFFFFF" w:themeFill="background1"/>
+            </w:pPr>
             <w:r>
               <w:t>1</w:t>
             </w:r>
@@ -533,9 +1582,12 @@
         </w:tc>
         <w:tc>
           <w:tcPr>
-            <w:tcW w:type="dxa" w:w="1003"/>
+            <w:tcW w:w="1131" w:type="dxa"/>
           </w:tcPr>
           <w:p>
+            <w:pPr>
+              <w:shd w:val="clear" w:color="auto" w:fill="FFFFFF" w:themeFill="background1"/>
+            </w:pPr>
             <w:r>
               <w:t>0.00</w:t>
             </w:r>
@@ -543,9 +1595,12 @@
         </w:tc>
         <w:tc>
           <w:tcPr>
-            <w:tcW w:type="dxa" w:w="1003"/>
+            <w:tcW w:w="926" w:type="dxa"/>
           </w:tcPr>
           <w:p>
+            <w:pPr>
+              <w:shd w:val="clear" w:color="auto" w:fill="FFFFFF" w:themeFill="background1"/>
+            </w:pPr>
             <w:r>
               <w:t>0.00</w:t>
             </w:r>
@@ -553,9 +1608,12 @@
         </w:tc>
         <w:tc>
           <w:tcPr>
-            <w:tcW w:type="dxa" w:w="1003"/>
+            <w:tcW w:w="1029" w:type="dxa"/>
           </w:tcPr>
           <w:p>
+            <w:pPr>
+              <w:shd w:val="clear" w:color="auto" w:fill="FFFFFF" w:themeFill="background1"/>
+            </w:pPr>
             <w:r>
               <w:t>12.00</w:t>
             </w:r>
@@ -563,9 +1621,12 @@
         </w:tc>
         <w:tc>
           <w:tcPr>
-            <w:tcW w:type="dxa" w:w="1003"/>
+            <w:tcW w:w="1131" w:type="dxa"/>
           </w:tcPr>
           <w:p>
+            <w:pPr>
+              <w:shd w:val="clear" w:color="auto" w:fill="FFFFFF" w:themeFill="background1"/>
+            </w:pPr>
             <w:r>
               <w:t>6.00</w:t>
             </w:r>
@@ -573,9 +1634,12 @@
         </w:tc>
         <w:tc>
           <w:tcPr>
-            <w:tcW w:type="dxa" w:w="1003"/>
+            <w:tcW w:w="1337" w:type="dxa"/>
           </w:tcPr>
           <w:p>
+            <w:pPr>
+              <w:shd w:val="clear" w:color="auto" w:fill="FFFFFF" w:themeFill="background1"/>
+            </w:pPr>
             <w:r>
               <w:t>12.00</w:t>
             </w:r>
@@ -583,9 +1647,12 @@
         </w:tc>
         <w:tc>
           <w:tcPr>
-            <w:tcW w:type="dxa" w:w="1003"/>
+            <w:tcW w:w="1234" w:type="dxa"/>
           </w:tcPr>
           <w:p>
+            <w:pPr>
+              <w:shd w:val="clear" w:color="auto" w:fill="FFFFFF" w:themeFill="background1"/>
+            </w:pPr>
             <w:r>
               <w:t>0.00</w:t>
             </w:r>
@@ -595,9 +1662,12 @@
       <w:tr>
         <w:tc>
           <w:tcPr>
-            <w:tcW w:type="dxa" w:w="1003"/>
+            <w:tcW w:w="926" w:type="dxa"/>
           </w:tcPr>
           <w:p>
+            <w:pPr>
+              <w:shd w:val="clear" w:color="auto" w:fill="FFFFFF" w:themeFill="background1"/>
+            </w:pPr>
             <w:r>
               <w:t>TaskB</w:t>
             </w:r>
@@ -605,9 +1675,12 @@
         </w:tc>
         <w:tc>
           <w:tcPr>
-            <w:tcW w:type="dxa" w:w="1003"/>
+            <w:tcW w:w="926" w:type="dxa"/>
           </w:tcPr>
           <w:p>
+            <w:pPr>
+              <w:shd w:val="clear" w:color="auto" w:fill="FFFFFF" w:themeFill="background1"/>
+            </w:pPr>
             <w:r>
               <w:t>4.00</w:t>
             </w:r>
@@ -615,9 +1688,12 @@
         </w:tc>
         <w:tc>
           <w:tcPr>
-            <w:tcW w:type="dxa" w:w="1003"/>
+            <w:tcW w:w="720" w:type="dxa"/>
           </w:tcPr>
           <w:p>
+            <w:pPr>
+              <w:shd w:val="clear" w:color="auto" w:fill="FFFFFF" w:themeFill="background1"/>
+            </w:pPr>
             <w:r>
               <w:t>2</w:t>
             </w:r>
@@ -625,9 +1701,12 @@
         </w:tc>
         <w:tc>
           <w:tcPr>
-            <w:tcW w:type="dxa" w:w="1003"/>
+            <w:tcW w:w="1131" w:type="dxa"/>
           </w:tcPr>
           <w:p>
+            <w:pPr>
+              <w:shd w:val="clear" w:color="auto" w:fill="FFFFFF" w:themeFill="background1"/>
+            </w:pPr>
             <w:r>
               <w:t>0.00</w:t>
             </w:r>
@@ -635,9 +1714,12 @@
         </w:tc>
         <w:tc>
           <w:tcPr>
-            <w:tcW w:type="dxa" w:w="1003"/>
+            <w:tcW w:w="926" w:type="dxa"/>
           </w:tcPr>
           <w:p>
+            <w:pPr>
+              <w:shd w:val="clear" w:color="auto" w:fill="FFFFFF" w:themeFill="background1"/>
+            </w:pPr>
             <w:r>
               <w:t>2.00</w:t>
             </w:r>
@@ -645,9 +1727,12 @@
         </w:tc>
         <w:tc>
           <w:tcPr>
-            <w:tcW w:type="dxa" w:w="1003"/>
+            <w:tcW w:w="1029" w:type="dxa"/>
           </w:tcPr>
           <w:p>
+            <w:pPr>
+              <w:shd w:val="clear" w:color="auto" w:fill="FFFFFF" w:themeFill="background1"/>
+            </w:pPr>
             <w:r>
               <w:t>10.00</w:t>
             </w:r>
@@ -655,9 +1740,12 @@
         </w:tc>
         <w:tc>
           <w:tcPr>
-            <w:tcW w:type="dxa" w:w="1003"/>
+            <w:tcW w:w="1131" w:type="dxa"/>
           </w:tcPr>
           <w:p>
+            <w:pPr>
+              <w:shd w:val="clear" w:color="auto" w:fill="FFFFFF" w:themeFill="background1"/>
+            </w:pPr>
             <w:r>
               <w:t>6.00</w:t>
             </w:r>
@@ -665,9 +1753,12 @@
         </w:tc>
         <w:tc>
           <w:tcPr>
-            <w:tcW w:type="dxa" w:w="1003"/>
+            <w:tcW w:w="1337" w:type="dxa"/>
           </w:tcPr>
           <w:p>
+            <w:pPr>
+              <w:shd w:val="clear" w:color="auto" w:fill="FFFFFF" w:themeFill="background1"/>
+            </w:pPr>
             <w:r>
               <w:t>10.00</w:t>
             </w:r>
@@ -675,9 +1766,12 @@
         </w:tc>
         <w:tc>
           <w:tcPr>
-            <w:tcW w:type="dxa" w:w="1003"/>
+            <w:tcW w:w="1234" w:type="dxa"/>
           </w:tcPr>
           <w:p>
+            <w:pPr>
+              <w:shd w:val="clear" w:color="auto" w:fill="FFFFFF" w:themeFill="background1"/>
+            </w:pPr>
             <w:r>
               <w:t>2.00</w:t>
             </w:r>
@@ -687,19 +1781,27 @@
       <w:tr>
         <w:tc>
           <w:tcPr>
-            <w:tcW w:type="dxa" w:w="1003"/>
+            <w:tcW w:w="926" w:type="dxa"/>
           </w:tcPr>
           <w:p>
+            <w:pPr>
+              <w:shd w:val="clear" w:color="auto" w:fill="FFFFFF" w:themeFill="background1"/>
+            </w:pPr>
+            <w:proofErr w:type="spellStart"/>
             <w:r>
               <w:t>TaskC</w:t>
             </w:r>
+            <w:proofErr w:type="spellEnd"/>
           </w:p>
         </w:tc>
         <w:tc>
           <w:tcPr>
-            <w:tcW w:type="dxa" w:w="1003"/>
+            <w:tcW w:w="926" w:type="dxa"/>
           </w:tcPr>
           <w:p>
+            <w:pPr>
+              <w:shd w:val="clear" w:color="auto" w:fill="FFFFFF" w:themeFill="background1"/>
+            </w:pPr>
             <w:r>
               <w:t>8.00</w:t>
             </w:r>
@@ -707,9 +1809,12 @@
         </w:tc>
         <w:tc>
           <w:tcPr>
-            <w:tcW w:type="dxa" w:w="1003"/>
+            <w:tcW w:w="720" w:type="dxa"/>
           </w:tcPr>
           <w:p>
+            <w:pPr>
+              <w:shd w:val="clear" w:color="auto" w:fill="FFFFFF" w:themeFill="background1"/>
+            </w:pPr>
             <w:r>
               <w:t>1</w:t>
             </w:r>
@@ -717,9 +1822,12 @@
         </w:tc>
         <w:tc>
           <w:tcPr>
-            <w:tcW w:type="dxa" w:w="1003"/>
+            <w:tcW w:w="1131" w:type="dxa"/>
           </w:tcPr>
           <w:p>
+            <w:pPr>
+              <w:shd w:val="clear" w:color="auto" w:fill="FFFFFF" w:themeFill="background1"/>
+            </w:pPr>
             <w:r>
               <w:t>0.00</w:t>
             </w:r>
@@ -727,9 +1835,12 @@
         </w:tc>
         <w:tc>
           <w:tcPr>
-            <w:tcW w:type="dxa" w:w="1003"/>
+            <w:tcW w:w="926" w:type="dxa"/>
           </w:tcPr>
           <w:p>
+            <w:pPr>
+              <w:shd w:val="clear" w:color="auto" w:fill="FFFFFF" w:themeFill="background1"/>
+            </w:pPr>
             <w:r>
               <w:t>4.00</w:t>
             </w:r>
@@ -737,9 +1848,12 @@
         </w:tc>
         <w:tc>
           <w:tcPr>
-            <w:tcW w:type="dxa" w:w="1003"/>
+            <w:tcW w:w="1029" w:type="dxa"/>
           </w:tcPr>
           <w:p>
+            <w:pPr>
+              <w:shd w:val="clear" w:color="auto" w:fill="FFFFFF" w:themeFill="background1"/>
+            </w:pPr>
             <w:r>
               <w:t>18.00</w:t>
             </w:r>
@@ -747,9 +1861,12 @@
         </w:tc>
         <w:tc>
           <w:tcPr>
-            <w:tcW w:type="dxa" w:w="1003"/>
+            <w:tcW w:w="1131" w:type="dxa"/>
           </w:tcPr>
           <w:p>
+            <w:pPr>
+              <w:shd w:val="clear" w:color="auto" w:fill="FFFFFF" w:themeFill="background1"/>
+            </w:pPr>
             <w:r>
               <w:t>10.00</w:t>
             </w:r>
@@ -757,9 +1874,12 @@
         </w:tc>
         <w:tc>
           <w:tcPr>
-            <w:tcW w:type="dxa" w:w="1003"/>
+            <w:tcW w:w="1337" w:type="dxa"/>
           </w:tcPr>
           <w:p>
+            <w:pPr>
+              <w:shd w:val="clear" w:color="auto" w:fill="FFFFFF" w:themeFill="background1"/>
+            </w:pPr>
             <w:r>
               <w:t>18.00</w:t>
             </w:r>
@@ -767,9 +1887,12 @@
         </w:tc>
         <w:tc>
           <w:tcPr>
-            <w:tcW w:type="dxa" w:w="1003"/>
+            <w:tcW w:w="1234" w:type="dxa"/>
           </w:tcPr>
           <w:p>
+            <w:pPr>
+              <w:shd w:val="clear" w:color="auto" w:fill="FFFFFF" w:themeFill="background1"/>
+            </w:pPr>
             <w:r>
               <w:t>4.00</w:t>
             </w:r>
@@ -778,17 +1901,36 @@
       </w:tr>
     </w:tbl>
     <w:p>
-      <w:pPr/>
-    </w:p>
-    <w:p>
-      <w:pPr/>
-      <w:r>
+      <w:pPr>
+        <w:shd w:val="clear" w:color="auto" w:fill="FFFFFF" w:themeFill="background1"/>
+        <w:spacing w:before="240"/>
+      </w:pPr>
+      <w:r>
+        <w:t xml:space="preserve"> </w:t>
+      </w:r>
+    </w:p>
+    <w:p>
+      <w:pPr>
+        <w:shd w:val="clear" w:color="auto" w:fill="FFFFFF" w:themeFill="background1"/>
+        <w:spacing w:after="120"/>
+      </w:pPr>
+      <w:r>
+        <w:rPr>
+          <w:b/>
+          <w:bCs/>
+        </w:rPr>
         <w:t>Analysis:</w:t>
       </w:r>
     </w:p>
     <w:p>
       <w:pPr>
         <w:pStyle w:val="ListParagraph"/>
+        <w:numPr>
+          <w:ilvl w:val="0"/>
+          <w:numId w:val="2"/>
+        </w:numPr>
+        <w:shd w:val="clear" w:color="auto" w:fill="FFFFFF" w:themeFill="background1"/>
+        <w:spacing w:after="100"/>
       </w:pPr>
       <w:r>
         <w:t>RR distributes CPU time fairly — no single task monopolises the processor.</w:t>
@@ -797,6 +1939,12 @@
     <w:p>
       <w:pPr>
         <w:pStyle w:val="ListParagraph"/>
+        <w:numPr>
+          <w:ilvl w:val="0"/>
+          <w:numId w:val="2"/>
+        </w:numPr>
+        <w:shd w:val="clear" w:color="auto" w:fill="FFFFFF" w:themeFill="background1"/>
+        <w:spacing w:after="100"/>
       </w:pPr>
       <w:r>
         <w:t>Short tasks (TaskB, burst=4) finish earlier than long ones despite being added second.</w:t>
@@ -805,73 +1953,254 @@
     <w:p>
       <w:pPr>
         <w:pStyle w:val="ListParagraph"/>
-      </w:pPr>
-      <w:r>
+        <w:numPr>
+          <w:ilvl w:val="0"/>
+          <w:numId w:val="2"/>
+        </w:numPr>
+        <w:shd w:val="clear" w:color="auto" w:fill="FFFFFF" w:themeFill="background1"/>
+        <w:spacing w:after="100"/>
+      </w:pPr>
+      <w:r>
+        <w:lastRenderedPageBreak/>
         <w:t>Turnaround time grows with burst length; waiting time is directly affected by quantum size.</w:t>
       </w:r>
     </w:p>
     <w:p>
       <w:pPr>
         <w:pStyle w:val="ListParagraph"/>
+        <w:numPr>
+          <w:ilvl w:val="0"/>
+          <w:numId w:val="2"/>
+        </w:numPr>
+        <w:shd w:val="clear" w:color="auto" w:fill="FFFFFF" w:themeFill="background1"/>
+        <w:spacing w:after="100"/>
       </w:pPr>
       <w:r>
         <w:t>A smaller quantum (e.g., 1s) reduces response time but increases context-switch overhead.</w:t>
       </w:r>
     </w:p>
     <w:p>
-      <w:pPr/>
+      <w:pPr>
+        <w:shd w:val="clear" w:color="auto" w:fill="FFFFFF" w:themeFill="background1"/>
+        <w:spacing w:after="200"/>
+      </w:pPr>
       <w:r>
         <w:t xml:space="preserve"> </w:t>
       </w:r>
     </w:p>
     <w:p>
       <w:pPr>
-        <w:pStyle w:val="Strong1"/>
-        <w:jc w:val="both"/>
-      </w:pPr>
-      <w:r>
+        <w:pStyle w:val="Heading3"/>
+        <w:shd w:val="clear" w:color="auto" w:fill="FFFFFF" w:themeFill="background1"/>
+        <w:spacing w:after="200"/>
+        <w:rPr>
+          <w:sz w:val="24"/>
+          <w:szCs w:val="24"/>
+        </w:rPr>
+      </w:pPr>
+      <w:r>
+        <w:rPr>
+          <w:sz w:val="24"/>
+          <w:szCs w:val="24"/>
+        </w:rPr>
         <w:t>Priority Sample Run</w:t>
       </w:r>
     </w:p>
     <w:p>
-      <w:pPr/>
+      <w:pPr>
+        <w:shd w:val="clear" w:color="auto" w:fill="FFFFFF" w:themeFill="background1"/>
+        <w:spacing w:after="120"/>
+      </w:pPr>
       <w:r>
         <w:t>Commands used:</w:t>
       </w:r>
     </w:p>
     <w:p>
-      <w:pPr/>
-      <w:r>
-        <w:rPr>
-          <w:rFonts w:ascii="Courier New" w:hAnsi="Courier New"/>
-          <w:sz w:val="18"/>
-        </w:rPr>
-        <w:t>schedule priority</w:t>
+      <w:pPr>
+        <w:shd w:val="clear" w:color="auto" w:fill="FFFFFF" w:themeFill="background1"/>
+        <w:spacing w:before="160" w:after="200"/>
+        <w:ind w:left="240" w:right="240"/>
+        <w:rPr>
+          <w:color w:val="000000" w:themeColor="text1"/>
+        </w:rPr>
+      </w:pPr>
+      <w:r>
+        <w:rPr>
+          <w:rFonts w:ascii="Courier New" w:eastAsia="Courier New" w:hAnsi="Courier New" w:cs="Courier New"/>
+          <w:color w:val="000000" w:themeColor="text1"/>
+          <w:sz w:val="20"/>
+          <w:szCs w:val="20"/>
+        </w:rPr>
+        <w:t xml:space="preserve">         </w:t>
+      </w:r>
+      <w:r>
+        <w:rPr>
+          <w:color w:val="000000" w:themeColor="text1"/>
+        </w:rPr>
         <w:br/>
-        <w:t>add-task TaskA 6 3</w:t>
+      </w:r>
+      <w:r>
+        <w:rPr>
+          <w:rFonts w:ascii="Courier New" w:eastAsia="Courier New" w:hAnsi="Courier New" w:cs="Courier New"/>
+          <w:color w:val="000000" w:themeColor="text1"/>
+          <w:sz w:val="20"/>
+          <w:szCs w:val="20"/>
+        </w:rPr>
+        <w:t xml:space="preserve">    schedule priority    </w:t>
+      </w:r>
+      <w:r>
+        <w:rPr>
+          <w:color w:val="000000" w:themeColor="text1"/>
+        </w:rPr>
         <w:br/>
-        <w:t>add-task TaskB 4 1</w:t>
+      </w:r>
+      <w:r>
+        <w:rPr>
+          <w:rFonts w:ascii="Courier New" w:eastAsia="Courier New" w:hAnsi="Courier New" w:cs="Courier New"/>
+          <w:color w:val="000000" w:themeColor="text1"/>
+          <w:sz w:val="20"/>
+          <w:szCs w:val="20"/>
+        </w:rPr>
+        <w:t xml:space="preserve">    add-task TaskA 6 3    </w:t>
+      </w:r>
+      <w:r>
+        <w:rPr>
+          <w:color w:val="000000" w:themeColor="text1"/>
+        </w:rPr>
         <w:br/>
-        <w:t>add-task TaskC 8 2</w:t>
+      </w:r>
+      <w:r>
+        <w:rPr>
+          <w:rFonts w:ascii="Courier New" w:eastAsia="Courier New" w:hAnsi="Courier New" w:cs="Courier New"/>
+          <w:color w:val="000000" w:themeColor="text1"/>
+          <w:sz w:val="20"/>
+          <w:szCs w:val="20"/>
+        </w:rPr>
+        <w:t xml:space="preserve">    add-task TaskB 4 1    </w:t>
+      </w:r>
+      <w:r>
+        <w:rPr>
+          <w:color w:val="000000" w:themeColor="text1"/>
+        </w:rPr>
         <w:br/>
-        <w:t>run-scheduler</w:t>
-      </w:r>
-    </w:p>
-    <w:p>
-      <w:pPr/>
-      <w:r>
-        <w:t>Execution order: TaskB (priority 1) → TaskC (priority 2) → TaskA (priority 3).</w:t>
-      </w:r>
-    </w:p>
-    <w:p>
-      <w:pPr/>
-      <w:r>
+      </w:r>
+      <w:r>
+        <w:rPr>
+          <w:rFonts w:ascii="Courier New" w:eastAsia="Courier New" w:hAnsi="Courier New" w:cs="Courier New"/>
+          <w:color w:val="000000" w:themeColor="text1"/>
+          <w:sz w:val="20"/>
+          <w:szCs w:val="20"/>
+        </w:rPr>
+        <w:t xml:space="preserve">    add-task </w:t>
+      </w:r>
+      <w:proofErr w:type="spellStart"/>
+      <w:r>
+        <w:rPr>
+          <w:rFonts w:ascii="Courier New" w:eastAsia="Courier New" w:hAnsi="Courier New" w:cs="Courier New"/>
+          <w:color w:val="000000" w:themeColor="text1"/>
+          <w:sz w:val="20"/>
+          <w:szCs w:val="20"/>
+        </w:rPr>
+        <w:t>TaskC</w:t>
+      </w:r>
+      <w:proofErr w:type="spellEnd"/>
+      <w:r>
+        <w:rPr>
+          <w:rFonts w:ascii="Courier New" w:eastAsia="Courier New" w:hAnsi="Courier New" w:cs="Courier New"/>
+          <w:color w:val="000000" w:themeColor="text1"/>
+          <w:sz w:val="20"/>
+          <w:szCs w:val="20"/>
+        </w:rPr>
+        <w:t xml:space="preserve"> 8 2    </w:t>
+      </w:r>
+      <w:r>
+        <w:rPr>
+          <w:color w:val="000000" w:themeColor="text1"/>
+        </w:rPr>
+        <w:br/>
+      </w:r>
+      <w:r>
+        <w:rPr>
+          <w:rFonts w:ascii="Courier New" w:eastAsia="Courier New" w:hAnsi="Courier New" w:cs="Courier New"/>
+          <w:color w:val="000000" w:themeColor="text1"/>
+          <w:sz w:val="20"/>
+          <w:szCs w:val="20"/>
+        </w:rPr>
+        <w:t xml:space="preserve">    run-scheduler    </w:t>
+      </w:r>
+      <w:r>
+        <w:rPr>
+          <w:color w:val="000000" w:themeColor="text1"/>
+        </w:rPr>
+        <w:br/>
+      </w:r>
+      <w:r>
+        <w:rPr>
+          <w:rFonts w:ascii="Courier New" w:eastAsia="Courier New" w:hAnsi="Courier New" w:cs="Courier New"/>
+          <w:color w:val="000000" w:themeColor="text1"/>
+          <w:sz w:val="20"/>
+          <w:szCs w:val="20"/>
+        </w:rPr>
+        <w:t xml:space="preserve">         </w:t>
+      </w:r>
+    </w:p>
+    <w:p>
+      <w:pPr>
+        <w:shd w:val="clear" w:color="auto" w:fill="FFFFFF" w:themeFill="background1"/>
+        <w:spacing w:after="200"/>
+      </w:pPr>
+      <w:r>
+        <w:t xml:space="preserve"> </w:t>
+      </w:r>
+    </w:p>
+    <w:p>
+      <w:pPr>
+        <w:shd w:val="clear" w:color="auto" w:fill="FFFFFF" w:themeFill="background1"/>
+        <w:spacing w:after="120"/>
+      </w:pPr>
+      <w:r>
+        <w:t xml:space="preserve">Execution order: TaskB (priority 1) → </w:t>
+      </w:r>
+      <w:proofErr w:type="spellStart"/>
+      <w:r>
+        <w:t>TaskC</w:t>
+      </w:r>
+      <w:proofErr w:type="spellEnd"/>
+      <w:r>
+        <w:t xml:space="preserve"> (priority 2) → TaskA (priority 3).</w:t>
+      </w:r>
+    </w:p>
+    <w:p>
+      <w:pPr>
+        <w:shd w:val="clear" w:color="auto" w:fill="FFFFFF" w:themeFill="background1"/>
+        <w:spacing w:after="200"/>
+      </w:pPr>
+      <w:r>
+        <w:t xml:space="preserve"> </w:t>
+      </w:r>
+    </w:p>
+    <w:p>
+      <w:pPr>
+        <w:shd w:val="clear" w:color="auto" w:fill="FFFFFF" w:themeFill="background1"/>
+        <w:spacing w:after="120"/>
+      </w:pPr>
+      <w:r>
+        <w:rPr>
+          <w:b/>
+          <w:bCs/>
+        </w:rPr>
         <w:t>Analysis:</w:t>
       </w:r>
     </w:p>
     <w:p>
       <w:pPr>
         <w:pStyle w:val="ListParagraph"/>
+        <w:numPr>
+          <w:ilvl w:val="0"/>
+          <w:numId w:val="2"/>
+        </w:numPr>
+        <w:shd w:val="clear" w:color="auto" w:fill="FFFFFF" w:themeFill="background1"/>
+        <w:spacing w:after="100"/>
       </w:pPr>
       <w:r>
         <w:t>High-priority tasks always run before lower-priority ones, guaranteeing short response time for critical processes.</w:t>
@@ -880,168 +2209,565 @@
     <w:p>
       <w:pPr>
         <w:pStyle w:val="ListParagraph"/>
-      </w:pPr>
-      <w:r>
-        <w:t>If TaskA were added after TaskB starts running, preemption would pause TaskB and run TaskA immediately.</w:t>
+        <w:numPr>
+          <w:ilvl w:val="0"/>
+          <w:numId w:val="2"/>
+        </w:numPr>
+        <w:shd w:val="clear" w:color="auto" w:fill="FFFFFF" w:themeFill="background1"/>
+        <w:spacing w:after="100"/>
+      </w:pPr>
+      <w:r>
+        <w:t xml:space="preserve">If TaskA were added after TaskB starts running, </w:t>
+      </w:r>
+      <w:proofErr w:type="spellStart"/>
+      <w:r>
+        <w:t>preemption</w:t>
+      </w:r>
+      <w:proofErr w:type="spellEnd"/>
+      <w:r>
+        <w:t xml:space="preserve"> would pause TaskB and run TaskA immediately.</w:t>
       </w:r>
     </w:p>
     <w:p>
       <w:pPr>
         <w:pStyle w:val="ListParagraph"/>
-      </w:pPr>
-      <w:r>
-        <w:t>The main risk is starvation: low-priority tasks may never run if high-priority tasks keep arriving. A real system would add aging (incrementally boosting priority over time) to counter this.</w:t>
-      </w:r>
-    </w:p>
-    <w:p>
-      <w:pPr/>
+        <w:numPr>
+          <w:ilvl w:val="0"/>
+          <w:numId w:val="2"/>
+        </w:numPr>
+        <w:shd w:val="clear" w:color="auto" w:fill="FFFFFF" w:themeFill="background1"/>
+        <w:spacing w:after="100"/>
+      </w:pPr>
+      <w:r>
+        <w:t xml:space="preserve">The main risk is </w:t>
+      </w:r>
+      <w:r>
+        <w:rPr>
+          <w:b/>
+          <w:bCs/>
+        </w:rPr>
+        <w:t>starvation</w:t>
+      </w:r>
+      <w:r>
+        <w:t>: low-priority tasks may never run if high-priority tasks keep arriving. A real system would add aging (incrementally boosting priority over time) to counter this.</w:t>
+      </w:r>
+    </w:p>
+    <w:p>
+      <w:pPr>
+        <w:shd w:val="clear" w:color="auto" w:fill="FFFFFF" w:themeFill="background1"/>
+        <w:spacing w:after="200"/>
+      </w:pPr>
       <w:r>
         <w:t xml:space="preserve"> </w:t>
       </w:r>
     </w:p>
     <w:p>
       <w:pPr>
-        <w:pStyle w:val="Strong1"/>
-        <w:jc w:val="both"/>
-      </w:pPr>
-      <w:r>
+        <w:shd w:val="clear" w:color="auto" w:fill="FFFFFF" w:themeFill="background1"/>
+        <w:spacing w:after="200"/>
+      </w:pPr>
+      <w:r>
+        <w:t xml:space="preserve"> </w:t>
+      </w:r>
+    </w:p>
+    <w:p>
+      <w:pPr>
+        <w:pStyle w:val="Heading2"/>
+        <w:shd w:val="clear" w:color="auto" w:fill="FFFFFF" w:themeFill="background1"/>
+        <w:spacing w:after="200"/>
+        <w:rPr>
+          <w:sz w:val="28"/>
+          <w:szCs w:val="28"/>
+        </w:rPr>
+      </w:pPr>
+      <w:r>
+        <w:rPr>
+          <w:sz w:val="28"/>
+          <w:szCs w:val="28"/>
+        </w:rPr>
         <w:t>3. Challenges and Improvements</w:t>
       </w:r>
     </w:p>
     <w:p>
       <w:pPr>
-        <w:pStyle w:val="Strong1"/>
-        <w:jc w:val="both"/>
-      </w:pPr>
-      <w:r>
+        <w:pStyle w:val="Heading3"/>
+        <w:shd w:val="clear" w:color="auto" w:fill="FFFFFF" w:themeFill="background1"/>
+        <w:spacing w:after="200"/>
+        <w:rPr>
+          <w:sz w:val="24"/>
+          <w:szCs w:val="24"/>
+        </w:rPr>
+      </w:pPr>
+      <w:r>
+        <w:rPr>
+          <w:sz w:val="24"/>
+          <w:szCs w:val="24"/>
+        </w:rPr>
         <w:t>Challenge 1 — Simulated vs Real Clock</w:t>
       </w:r>
     </w:p>
     <w:p>
-      <w:pPr/>
-      <w:r>
-        <w:t>time.sleep() is used to simulate CPU burst time. On Windows, sleep resolution is ~15 ms, so very short bursts (&lt; 15 ms) may not be accurate. All demo bursts are multi-second to make the simulation clearly visible.</w:t>
-      </w:r>
-    </w:p>
-    <w:p>
-      <w:pPr/>
+      <w:pPr>
+        <w:shd w:val="clear" w:color="auto" w:fill="FFFFFF" w:themeFill="background1"/>
+        <w:spacing w:after="120"/>
+      </w:pPr>
+      <w:proofErr w:type="spellStart"/>
+      <w:proofErr w:type="gramStart"/>
+      <w:r>
+        <w:rPr>
+          <w:rFonts w:ascii="Courier New" w:eastAsia="Courier New" w:hAnsi="Courier New" w:cs="Courier New"/>
+          <w:shd w:val="clear" w:color="auto" w:fill="FFFFFF" w:themeFill="background1"/>
+        </w:rPr>
+        <w:t>time.sleep</w:t>
+      </w:r>
+      <w:proofErr w:type="spellEnd"/>
+      <w:proofErr w:type="gramEnd"/>
+      <w:r>
+        <w:rPr>
+          <w:rFonts w:ascii="Courier New" w:eastAsia="Courier New" w:hAnsi="Courier New" w:cs="Courier New"/>
+          <w:shd w:val="clear" w:color="auto" w:fill="FFFFFF" w:themeFill="background1"/>
+        </w:rPr>
+        <w:t>()</w:t>
+      </w:r>
+      <w:r>
+        <w:t xml:space="preserve"> is used to simulate CPU burst time. On Windows, sleep resolution is ~15 </w:t>
+      </w:r>
+      <w:proofErr w:type="spellStart"/>
+      <w:r>
+        <w:t>ms</w:t>
+      </w:r>
+      <w:proofErr w:type="spellEnd"/>
+      <w:r>
+        <w:t xml:space="preserve">, so very short bursts (&lt; 15 </w:t>
+      </w:r>
+      <w:proofErr w:type="spellStart"/>
+      <w:r>
+        <w:t>ms</w:t>
+      </w:r>
+      <w:proofErr w:type="spellEnd"/>
+      <w:r>
+        <w:t>) may not be accurate. All demo bursts are multi-second to make the simulation clearly visible.</w:t>
+      </w:r>
+    </w:p>
+    <w:p>
+      <w:pPr>
+        <w:shd w:val="clear" w:color="auto" w:fill="FFFFFF" w:themeFill="background1"/>
+        <w:spacing w:after="200"/>
+      </w:pPr>
       <w:r>
         <w:t xml:space="preserve"> </w:t>
       </w:r>
     </w:p>
     <w:p>
       <w:pPr>
-        <w:pStyle w:val="Strong1"/>
-        <w:jc w:val="both"/>
-      </w:pPr>
-      <w:r>
-        <w:t>Challenge 2 — Preemption Granularity</w:t>
-      </w:r>
-    </w:p>
-    <w:p>
-      <w:pPr/>
-      <w:r>
-        <w:t>Preemption is checked every 100 ms slice. This means a new task can arrive but be delayed up to 100 ms before preempting the current one — acceptable for simulation purposes but not suitable for a real-time system.</w:t>
-      </w:r>
-    </w:p>
-    <w:p>
-      <w:pPr/>
+        <w:shd w:val="clear" w:color="auto" w:fill="FFFFFF" w:themeFill="background1"/>
+        <w:spacing w:after="200"/>
+      </w:pPr>
+    </w:p>
+    <w:p>
+      <w:pPr>
+        <w:shd w:val="clear" w:color="auto" w:fill="FFFFFF" w:themeFill="background1"/>
+        <w:spacing w:after="200"/>
+      </w:pPr>
+    </w:p>
+    <w:p>
+      <w:pPr>
+        <w:pStyle w:val="Heading3"/>
+        <w:shd w:val="clear" w:color="auto" w:fill="FFFFFF" w:themeFill="background1"/>
+        <w:spacing w:after="200"/>
+        <w:rPr>
+          <w:sz w:val="24"/>
+          <w:szCs w:val="24"/>
+        </w:rPr>
+      </w:pPr>
+      <w:r>
+        <w:rPr>
+          <w:sz w:val="24"/>
+          <w:szCs w:val="24"/>
+        </w:rPr>
+        <w:lastRenderedPageBreak/>
+        <w:t xml:space="preserve">Challenge 2 — </w:t>
+      </w:r>
+      <w:proofErr w:type="spellStart"/>
+      <w:r>
+        <w:rPr>
+          <w:sz w:val="24"/>
+          <w:szCs w:val="24"/>
+        </w:rPr>
+        <w:t>Preemption</w:t>
+      </w:r>
+      <w:proofErr w:type="spellEnd"/>
+      <w:r>
+        <w:rPr>
+          <w:sz w:val="24"/>
+          <w:szCs w:val="24"/>
+        </w:rPr>
+        <w:t xml:space="preserve"> Granularity</w:t>
+      </w:r>
+    </w:p>
+    <w:p>
+      <w:pPr>
+        <w:shd w:val="clear" w:color="auto" w:fill="FFFFFF" w:themeFill="background1"/>
+        <w:spacing w:after="120"/>
+      </w:pPr>
+      <w:proofErr w:type="spellStart"/>
+      <w:r>
+        <w:t>Preemption</w:t>
+      </w:r>
+      <w:proofErr w:type="spellEnd"/>
+      <w:r>
+        <w:t xml:space="preserve"> is checked every 100 </w:t>
+      </w:r>
+      <w:proofErr w:type="spellStart"/>
+      <w:r>
+        <w:t>ms</w:t>
+      </w:r>
+      <w:proofErr w:type="spellEnd"/>
+      <w:r>
+        <w:t xml:space="preserve"> slice. This means a new task can arrive but be delayed up to 100 </w:t>
+      </w:r>
+      <w:proofErr w:type="spellStart"/>
+      <w:r>
+        <w:t>ms</w:t>
+      </w:r>
+      <w:proofErr w:type="spellEnd"/>
+      <w:r>
+        <w:t xml:space="preserve"> before </w:t>
+      </w:r>
+      <w:proofErr w:type="spellStart"/>
+      <w:r>
+        <w:t>preempting</w:t>
+      </w:r>
+      <w:proofErr w:type="spellEnd"/>
+      <w:r>
+        <w:t xml:space="preserve"> the current one — acceptable for simulation purposes but not suitable for a real-time system.</w:t>
+      </w:r>
+    </w:p>
+    <w:p>
+      <w:pPr>
+        <w:shd w:val="clear" w:color="auto" w:fill="FFFFFF" w:themeFill="background1"/>
+        <w:spacing w:after="200"/>
+      </w:pPr>
       <w:r>
         <w:t xml:space="preserve"> </w:t>
       </w:r>
     </w:p>
     <w:p>
       <w:pPr>
-        <w:pStyle w:val="Strong1"/>
-        <w:jc w:val="both"/>
-      </w:pPr>
-      <w:r>
+        <w:pStyle w:val="Heading3"/>
+        <w:shd w:val="clear" w:color="auto" w:fill="FFFFFF" w:themeFill="background1"/>
+        <w:spacing w:after="200"/>
+        <w:rPr>
+          <w:sz w:val="24"/>
+          <w:szCs w:val="24"/>
+        </w:rPr>
+      </w:pPr>
+      <w:r>
+        <w:rPr>
+          <w:sz w:val="24"/>
+          <w:szCs w:val="24"/>
+        </w:rPr>
         <w:t>Challenge 3 — Thread Safety</w:t>
       </w:r>
     </w:p>
     <w:p>
-      <w:pPr/>
-      <w:r>
-        <w:t>The priority scheduler uses a threading.Lock around all heap operations so that any future extension adding tasks from a separate thread won't corrupt the heap. The current add-task command runs on the main thread, so no actual race condition occurs, but the architecture is prepared for it.</w:t>
-      </w:r>
-    </w:p>
-    <w:p>
-      <w:pPr>
-        <w:pStyle w:val="Strong1"/>
-        <w:jc w:val="both"/>
-      </w:pPr>
-      <w:r>
+      <w:pPr>
+        <w:shd w:val="clear" w:color="auto" w:fill="FFFFFF" w:themeFill="background1"/>
+        <w:spacing w:after="120"/>
+      </w:pPr>
+      <w:r>
+        <w:t xml:space="preserve">The priority scheduler uses a </w:t>
+      </w:r>
+      <w:proofErr w:type="spellStart"/>
+      <w:proofErr w:type="gramStart"/>
+      <w:r>
+        <w:rPr>
+          <w:rFonts w:ascii="Courier New" w:eastAsia="Courier New" w:hAnsi="Courier New" w:cs="Courier New"/>
+          <w:shd w:val="clear" w:color="auto" w:fill="FFFFFF" w:themeFill="background1"/>
+        </w:rPr>
+        <w:t>threading.Lock</w:t>
+      </w:r>
+      <w:proofErr w:type="spellEnd"/>
+      <w:proofErr w:type="gramEnd"/>
+      <w:r>
+        <w:t xml:space="preserve"> around all heap operations so that any future extension adding tasks from a separate thread won't corrupt the heap. The current </w:t>
+      </w:r>
+      <w:r>
+        <w:rPr>
+          <w:rFonts w:ascii="Courier New" w:eastAsia="Courier New" w:hAnsi="Courier New" w:cs="Courier New"/>
+          <w:shd w:val="clear" w:color="auto" w:fill="F1F5F9"/>
+        </w:rPr>
+        <w:t>add-task</w:t>
+      </w:r>
+      <w:r>
+        <w:t xml:space="preserve"> command runs on the main thread, so no actual race condition occurs, but the architecture is prepared for it.</w:t>
+      </w:r>
+    </w:p>
+    <w:p>
+      <w:pPr>
+        <w:shd w:val="clear" w:color="auto" w:fill="FFFFFF" w:themeFill="background1"/>
+        <w:spacing w:after="200"/>
+      </w:pPr>
+      <w:r>
+        <w:t xml:space="preserve"> </w:t>
+      </w:r>
+    </w:p>
+    <w:p>
+      <w:pPr>
+        <w:shd w:val="clear" w:color="auto" w:fill="FFFFFF" w:themeFill="background1"/>
+        <w:spacing w:after="200"/>
+      </w:pPr>
+    </w:p>
+    <w:p>
+      <w:pPr>
+        <w:pStyle w:val="Heading3"/>
+        <w:shd w:val="clear" w:color="auto" w:fill="FFFFFF" w:themeFill="background1"/>
+        <w:spacing w:after="200"/>
+        <w:rPr>
+          <w:sz w:val="24"/>
+          <w:szCs w:val="24"/>
+        </w:rPr>
+      </w:pPr>
+      <w:r>
+        <w:rPr>
+          <w:sz w:val="24"/>
+          <w:szCs w:val="24"/>
+        </w:rPr>
         <w:t>Possible Improvements</w:t>
       </w:r>
     </w:p>
     <w:p>
       <w:pPr>
         <w:pStyle w:val="ListParagraph"/>
-      </w:pPr>
-      <w:r>
-        <w:t>Aging for the priority scheduler to prevent starvation.</w:t>
+        <w:numPr>
+          <w:ilvl w:val="0"/>
+          <w:numId w:val="2"/>
+        </w:numPr>
+        <w:shd w:val="clear" w:color="auto" w:fill="FFFFFF" w:themeFill="background1"/>
+        <w:spacing w:after="100"/>
+      </w:pPr>
+      <w:r>
+        <w:rPr>
+          <w:b/>
+          <w:bCs/>
+        </w:rPr>
+        <w:t>Aging</w:t>
+      </w:r>
+      <w:r>
+        <w:t xml:space="preserve"> for the priority scheduler to prevent starvation.</w:t>
       </w:r>
     </w:p>
     <w:p>
       <w:pPr>
         <w:pStyle w:val="ListParagraph"/>
-      </w:pPr>
-      <w:r>
-        <w:t>Multilevel feedback queue that combines RR within priority bands.</w:t>
+        <w:numPr>
+          <w:ilvl w:val="0"/>
+          <w:numId w:val="2"/>
+        </w:numPr>
+        <w:shd w:val="clear" w:color="auto" w:fill="FFFFFF" w:themeFill="background1"/>
+        <w:spacing w:after="100"/>
+      </w:pPr>
+      <w:r>
+        <w:rPr>
+          <w:b/>
+          <w:bCs/>
+        </w:rPr>
+        <w:t>Multilevel feedback queue</w:t>
+      </w:r>
+      <w:r>
+        <w:t xml:space="preserve"> that combines RR within priority bands.</w:t>
       </w:r>
     </w:p>
     <w:p>
       <w:pPr>
         <w:pStyle w:val="ListParagraph"/>
-      </w:pPr>
-      <w:r>
-        <w:t>Real CPU binding using os.sched_setaffinity on Linux to actually pin simulated processes.</w:t>
+        <w:numPr>
+          <w:ilvl w:val="0"/>
+          <w:numId w:val="2"/>
+        </w:numPr>
+        <w:shd w:val="clear" w:color="auto" w:fill="FFFFFF" w:themeFill="background1"/>
+        <w:spacing w:after="100"/>
+      </w:pPr>
+      <w:r>
+        <w:rPr>
+          <w:b/>
+          <w:bCs/>
+        </w:rPr>
+        <w:t>Real CPU binding</w:t>
+      </w:r>
+      <w:r>
+        <w:t xml:space="preserve"> using </w:t>
+      </w:r>
+      <w:proofErr w:type="spellStart"/>
+      <w:proofErr w:type="gramStart"/>
+      <w:r>
+        <w:rPr>
+          <w:rFonts w:ascii="Courier New" w:eastAsia="Courier New" w:hAnsi="Courier New" w:cs="Courier New"/>
+          <w:shd w:val="clear" w:color="auto" w:fill="F1F5F9"/>
+        </w:rPr>
+        <w:t>os.sched</w:t>
+      </w:r>
+      <w:proofErr w:type="gramEnd"/>
+      <w:r>
+        <w:rPr>
+          <w:rFonts w:ascii="Courier New" w:eastAsia="Courier New" w:hAnsi="Courier New" w:cs="Courier New"/>
+          <w:shd w:val="clear" w:color="auto" w:fill="F1F5F9"/>
+        </w:rPr>
+        <w:t>_setaffinity</w:t>
+      </w:r>
+      <w:proofErr w:type="spellEnd"/>
+      <w:r>
+        <w:t xml:space="preserve"> on Linux to actually pin simulated processes.</w:t>
       </w:r>
     </w:p>
     <w:p>
       <w:pPr>
         <w:pStyle w:val="ListParagraph"/>
-      </w:pPr>
-      <w:r>
-        <w:t>Gantt chart ASCII output alongside the metrics table for visual clarity.</w:t>
-      </w:r>
-    </w:p>
-    <w:p>
-      <w:pPr/>
-      <w:r>
-        <w:t xml:space="preserve"> </w:t>
-      </w:r>
-    </w:p>
-    <w:p>
-      <w:pPr>
-        <w:pStyle w:val="Strong1"/>
-        <w:jc w:val="both"/>
-      </w:pPr>
-      <w:r>
-        <w:t>4. Screenshots</w:t>
-      </w:r>
-    </w:p>
-    <w:p>
-      <w:pPr>
-        <w:jc w:val="center"/>
-      </w:pPr>
-      <w:r>
+        <w:numPr>
+          <w:ilvl w:val="0"/>
+          <w:numId w:val="2"/>
+        </w:numPr>
+        <w:shd w:val="clear" w:color="auto" w:fill="FFFFFF" w:themeFill="background1"/>
+        <w:spacing w:after="100"/>
+        <w:rPr>
+          <w:color w:val="000000" w:themeColor="text1"/>
+        </w:rPr>
+      </w:pPr>
+      <w:r>
+        <w:rPr>
+          <w:b/>
+          <w:bCs/>
+        </w:rPr>
+        <w:t>Gantt chart</w:t>
+      </w:r>
+      <w:r>
+        <w:t xml:space="preserve"> ASCII output alongside the metrics table for visual clarity.</w:t>
+      </w:r>
+      <w:r>
+        <w:br/>
+      </w:r>
+    </w:p>
+    <w:p>
+      <w:pPr>
+        <w:pStyle w:val="ListParagraph"/>
+        <w:shd w:val="clear" w:color="auto" w:fill="FFFFFF" w:themeFill="background1"/>
+        <w:spacing w:after="100"/>
+        <w:ind w:left="180"/>
+        <w:rPr>
+          <w:color w:val="000000" w:themeColor="text1"/>
+        </w:rPr>
+      </w:pPr>
+    </w:p>
+    <w:p>
+      <w:pPr>
+        <w:pStyle w:val="ListParagraph"/>
+        <w:shd w:val="clear" w:color="auto" w:fill="FFFFFF" w:themeFill="background1"/>
+        <w:spacing w:after="100"/>
+        <w:ind w:left="180"/>
+        <w:rPr>
+          <w:color w:val="000000" w:themeColor="text1"/>
+        </w:rPr>
+      </w:pPr>
+    </w:p>
+    <w:p>
+      <w:pPr>
+        <w:shd w:val="clear" w:color="auto" w:fill="FFFFFF" w:themeFill="background1"/>
+        <w:spacing w:after="100"/>
+        <w:rPr>
+          <w:b/>
+          <w:bCs/>
+          <w:sz w:val="28"/>
+          <w:szCs w:val="28"/>
+        </w:rPr>
+      </w:pPr>
+      <w:r>
+        <w:rPr>
+          <w:b/>
+          <w:bCs/>
+          <w:sz w:val="28"/>
+          <w:szCs w:val="28"/>
+        </w:rPr>
+        <w:t>Screenshots</w:t>
+      </w:r>
+    </w:p>
+    <w:p>
+      <w:pPr>
+        <w:shd w:val="clear" w:color="auto" w:fill="FFFFFF" w:themeFill="background1"/>
+        <w:spacing w:after="100"/>
+        <w:rPr>
+          <w:b/>
+          <w:bCs/>
+          <w:sz w:val="28"/>
+          <w:szCs w:val="28"/>
+        </w:rPr>
+      </w:pPr>
+    </w:p>
+    <w:p>
+      <w:pPr>
+        <w:shd w:val="clear" w:color="auto" w:fill="FFFFFF" w:themeFill="background1"/>
+        <w:spacing w:after="100"/>
+      </w:pPr>
+      <w:r>
+        <w:t xml:space="preserve">Picture 1: </w:t>
+      </w:r>
+    </w:p>
+    <w:p>
+      <w:pPr>
+        <w:shd w:val="clear" w:color="auto" w:fill="FFFFFF" w:themeFill="background1"/>
+        <w:spacing w:after="100"/>
+      </w:pPr>
+      <w:r>
+        <w:t xml:space="preserve">This screenshot shows </w:t>
+      </w:r>
+      <w:r>
+        <w:t>Round-Robin scheduling with a configured time quantum, demonstrating cyclic execution, process switching, and calculated performance metrics.</w:t>
+      </w:r>
+    </w:p>
+    <w:p>
+      <w:pPr>
+        <w:shd w:val="clear" w:color="auto" w:fill="FFFFFF" w:themeFill="background1"/>
+        <w:spacing w:after="100"/>
+        <w:rPr>
+          <w:b/>
+          <w:bCs/>
+          <w:color w:val="000000" w:themeColor="text1"/>
+          <w:sz w:val="28"/>
+          <w:szCs w:val="28"/>
+        </w:rPr>
+      </w:pPr>
+      <w:r>
+        <w:rPr>
+          <w:b/>
+          <w:bCs/>
+          <w:noProof/>
+          <w:color w:val="000000" w:themeColor="text1"/>
+          <w:sz w:val="28"/>
+          <w:szCs w:val="28"/>
+        </w:rPr>
+        <w:lastRenderedPageBreak/>
         <w:drawing>
-          <wp:inline xmlns:a="http://schemas.openxmlformats.org/drawingml/2006/main" xmlns:pic="http://schemas.openxmlformats.org/drawingml/2006/picture">
-            <wp:extent cx="5486400" cy="3465095"/>
-            <wp:docPr id="1" name="Picture 1"/>
+          <wp:inline distT="0" distB="0" distL="0" distR="0" wp14:anchorId="6F53129D" wp14:editId="03A07649">
+            <wp:extent cx="5731510" cy="3620135"/>
+            <wp:effectExtent l="0" t="0" r="2540" b="0"/>
+            <wp:docPr id="1789918809" name="Picture 1"/>
             <wp:cNvGraphicFramePr>
-              <a:graphicFrameLocks noChangeAspect="1"/>
+              <a:graphicFrameLocks xmlns:a="http://schemas.openxmlformats.org/drawingml/2006/main" noChangeAspect="1"/>
             </wp:cNvGraphicFramePr>
-            <a:graphic>
+            <a:graphic xmlns:a="http://schemas.openxmlformats.org/drawingml/2006/main">
               <a:graphicData uri="http://schemas.openxmlformats.org/drawingml/2006/picture">
-                <pic:pic>
+                <pic:pic xmlns:pic="http://schemas.openxmlformats.org/drawingml/2006/picture">
                   <pic:nvPicPr>
-                    <pic:cNvPr id="0" name="success_1.png"/>
+                    <pic:cNvPr id="1789918809" name="Picture 1789918809"/>
                     <pic:cNvPicPr/>
                   </pic:nvPicPr>
                   <pic:blipFill>
-                    <a:blip r:embed="rId12"/>
+                    <a:blip r:embed="rId6" cstate="print">
+                      <a:extLst>
+                        <a:ext uri="{28A0092B-C50C-407E-A947-70E740481C1C}">
+                          <a14:useLocalDpi xmlns:a14="http://schemas.microsoft.com/office/drawing/2010/main" val="0"/>
+                        </a:ext>
+                      </a:extLst>
+                    </a:blip>
                     <a:stretch>
                       <a:fillRect/>
                     </a:stretch>
@@ -1049,9 +2775,11 @@
                   <pic:spPr>
                     <a:xfrm>
                       <a:off x="0" y="0"/>
-                      <a:ext cx="5486400" cy="3465095"/>
+                      <a:ext cx="5731510" cy="3620135"/>
                     </a:xfrm>
-                    <a:prstGeom prst="rect"/>
+                    <a:prstGeom prst="rect">
+                      <a:avLst/>
+                    </a:prstGeom>
                   </pic:spPr>
                 </pic:pic>
               </a:graphicData>
@@ -1062,37 +2790,114 @@
     </w:p>
     <w:p>
       <w:pPr>
-        <w:pStyle w:val="Caption"/>
-        <w:jc w:val="both"/>
-      </w:pPr>
-      <w:r>
-        <w:t>Figure 1: Round-Robin Scheduling — tasks cycling through the deque with quantum expiry</w:t>
-      </w:r>
-    </w:p>
-    <w:p>
-      <w:pPr/>
-    </w:p>
-    <w:p>
-      <w:pPr>
-        <w:jc w:val="center"/>
-      </w:pPr>
-      <w:r>
+        <w:shd w:val="clear" w:color="auto" w:fill="FFFFFF" w:themeFill="background1"/>
+        <w:spacing w:after="100"/>
+        <w:rPr>
+          <w:color w:val="000000" w:themeColor="text1"/>
+        </w:rPr>
+      </w:pPr>
+    </w:p>
+    <w:p>
+      <w:pPr>
+        <w:shd w:val="clear" w:color="auto" w:fill="FFFFFF" w:themeFill="background1"/>
+        <w:spacing w:after="100"/>
+        <w:rPr>
+          <w:color w:val="000000" w:themeColor="text1"/>
+        </w:rPr>
+      </w:pPr>
+    </w:p>
+    <w:p>
+      <w:pPr>
+        <w:shd w:val="clear" w:color="auto" w:fill="FFFFFF" w:themeFill="background1"/>
+        <w:spacing w:after="100"/>
+        <w:rPr>
+          <w:color w:val="000000" w:themeColor="text1"/>
+        </w:rPr>
+      </w:pPr>
+      <w:r>
+        <w:rPr>
+          <w:color w:val="000000" w:themeColor="text1"/>
+        </w:rPr>
+        <w:t xml:space="preserve">Picture 2: This screenshot shows </w:t>
+      </w:r>
+      <w:r>
+        <w:rPr>
+          <w:color w:val="000000" w:themeColor="text1"/>
+        </w:rPr>
+        <w:t xml:space="preserve">Priority-Based scheduling, highlighting priority execution order, </w:t>
+      </w:r>
+      <w:proofErr w:type="spellStart"/>
+      <w:r>
+        <w:rPr>
+          <w:color w:val="000000" w:themeColor="text1"/>
+        </w:rPr>
+        <w:t>preemption</w:t>
+      </w:r>
+      <w:proofErr w:type="spellEnd"/>
+      <w:r>
+        <w:rPr>
+          <w:color w:val="000000" w:themeColor="text1"/>
+        </w:rPr>
+        <w:t xml:space="preserve"> of lower-priority tasks, and accurate performance metric calculation.</w:t>
+      </w:r>
+    </w:p>
+    <w:p>
+      <w:pPr>
+        <w:shd w:val="clear" w:color="auto" w:fill="FFFFFF" w:themeFill="background1"/>
+        <w:spacing w:after="100"/>
+        <w:rPr>
+          <w:b/>
+          <w:bCs/>
+          <w:color w:val="000000" w:themeColor="text1"/>
+          <w:sz w:val="28"/>
+          <w:szCs w:val="28"/>
+        </w:rPr>
+      </w:pPr>
+    </w:p>
+    <w:p>
+      <w:pPr>
+        <w:shd w:val="clear" w:color="auto" w:fill="FFFFFF" w:themeFill="background1"/>
+        <w:spacing w:after="100"/>
+        <w:rPr>
+          <w:b/>
+          <w:bCs/>
+          <w:color w:val="000000" w:themeColor="text1"/>
+          <w:sz w:val="28"/>
+          <w:szCs w:val="28"/>
+        </w:rPr>
+      </w:pPr>
+      <w:r>
+        <w:rPr>
+          <w:b/>
+          <w:bCs/>
+          <w:noProof/>
+          <w:color w:val="000000" w:themeColor="text1"/>
+          <w:sz w:val="28"/>
+          <w:szCs w:val="28"/>
+        </w:rPr>
         <w:drawing>
-          <wp:inline xmlns:a="http://schemas.openxmlformats.org/drawingml/2006/main" xmlns:pic="http://schemas.openxmlformats.org/drawingml/2006/picture">
-            <wp:extent cx="5486400" cy="3465095"/>
-            <wp:docPr id="2" name="Picture 2"/>
+          <wp:inline distT="0" distB="0" distL="0" distR="0" wp14:anchorId="3270AE7B" wp14:editId="72D5801B">
+            <wp:extent cx="5731510" cy="3620135"/>
+            <wp:effectExtent l="0" t="0" r="2540" b="0"/>
+            <wp:docPr id="1400267565" name="Picture 2"/>
             <wp:cNvGraphicFramePr>
-              <a:graphicFrameLocks noChangeAspect="1"/>
+              <a:graphicFrameLocks xmlns:a="http://schemas.openxmlformats.org/drawingml/2006/main" noChangeAspect="1"/>
             </wp:cNvGraphicFramePr>
-            <a:graphic>
+            <a:graphic xmlns:a="http://schemas.openxmlformats.org/drawingml/2006/main">
               <a:graphicData uri="http://schemas.openxmlformats.org/drawingml/2006/picture">
-                <pic:pic>
+                <pic:pic xmlns:pic="http://schemas.openxmlformats.org/drawingml/2006/picture">
                   <pic:nvPicPr>
-                    <pic:cNvPr id="0" name="success_2.png"/>
+                    <pic:cNvPr id="1400267565" name="Picture 1400267565"/>
                     <pic:cNvPicPr/>
                   </pic:nvPicPr>
                   <pic:blipFill>
-                    <a:blip r:embed="rId13"/>
+                    <a:blip r:embed="rId7" cstate="print">
+                      <a:extLst>
+                        <a:ext uri="{28A0092B-C50C-407E-A947-70E740481C1C}">
+                          <a14:useLocalDpi xmlns:a14="http://schemas.microsoft.com/office/drawing/2010/main" val="0"/>
+                        </a:ext>
+                      </a:extLst>
+                    </a:blip>
                     <a:stretch>
                       <a:fillRect/>
                     </a:stretch>
@@ -1100,9 +2905,11 @@
                   <pic:spPr>
                     <a:xfrm>
                       <a:off x="0" y="0"/>
-                      <a:ext cx="5486400" cy="3465095"/>
+                      <a:ext cx="5731510" cy="3620135"/>
                     </a:xfrm>
-                    <a:prstGeom prst="rect"/>
+                    <a:prstGeom prst="rect">
+                      <a:avLst/>
+                    </a:prstGeom>
                   </pic:spPr>
                 </pic:pic>
               </a:graphicData>
@@ -1113,80 +2920,508 @@
     </w:p>
     <w:p>
       <w:pPr>
-        <w:pStyle w:val="Caption"/>
-        <w:jc w:val="both"/>
-      </w:pPr>
-      <w:r>
-        <w:t>Figure 2: Priority-Based Scheduling — higher-priority tasks preempting lower ones</w:t>
-      </w:r>
-    </w:p>
-    <w:p>
-      <w:pPr/>
-    </w:p>
-    <w:p>
-      <w:pPr/>
-      <w:r>
-        <w:br w:type="page"/>
-      </w:r>
-    </w:p>
-    <w:p>
-      <w:pPr/>
-      <w:r>
+        <w:shd w:val="clear" w:color="auto" w:fill="FFFFFF" w:themeFill="background1"/>
+        <w:tabs>
+          <w:tab w:val="left" w:pos="3216"/>
+        </w:tabs>
+        <w:spacing w:after="100"/>
+        <w:rPr>
+          <w:b/>
+          <w:bCs/>
+          <w:color w:val="000000" w:themeColor="text1"/>
+          <w:sz w:val="28"/>
+          <w:szCs w:val="28"/>
+        </w:rPr>
+      </w:pPr>
+      <w:r>
+        <w:rPr>
+          <w:noProof/>
+        </w:rPr>
+        <w:lastRenderedPageBreak/>
+        <w:drawing>
+          <wp:inline distT="0" distB="0" distL="0" distR="0" wp14:anchorId="31D422CF" wp14:editId="46270908">
+            <wp:extent cx="5731510" cy="1690061"/>
+            <wp:effectExtent l="0" t="0" r="2540" b="5715"/>
+            <wp:docPr id="1720348070" name="Picture 2" descr="Give | University of the Cumberlands"/>
+            <wp:cNvGraphicFramePr>
+              <a:graphicFrameLocks xmlns:a="http://schemas.openxmlformats.org/drawingml/2006/main" noChangeAspect="1"/>
+            </wp:cNvGraphicFramePr>
+            <a:graphic xmlns:a="http://schemas.openxmlformats.org/drawingml/2006/main">
+              <a:graphicData uri="http://schemas.openxmlformats.org/drawingml/2006/picture">
+                <pic:pic xmlns:pic="http://schemas.openxmlformats.org/drawingml/2006/picture">
+                  <pic:nvPicPr>
+                    <pic:cNvPr id="0" name="Picture 4" descr="Give | University of the Cumberlands"/>
+                    <pic:cNvPicPr>
+                      <a:picLocks noChangeAspect="1" noChangeArrowheads="1"/>
+                    </pic:cNvPicPr>
+                  </pic:nvPicPr>
+                  <pic:blipFill>
+                    <a:blip r:embed="rId8" r:link="rId9">
+                      <a:extLst>
+                        <a:ext uri="{28A0092B-C50C-407E-A947-70E740481C1C}">
+                          <a14:useLocalDpi xmlns:a14="http://schemas.microsoft.com/office/drawing/2010/main" val="0"/>
+                        </a:ext>
+                      </a:extLst>
+                    </a:blip>
+                    <a:srcRect t="17197" b="25385"/>
+                    <a:stretch>
+                      <a:fillRect/>
+                    </a:stretch>
+                  </pic:blipFill>
+                  <pic:spPr bwMode="auto">
+                    <a:xfrm>
+                      <a:off x="0" y="0"/>
+                      <a:ext cx="5731510" cy="1690061"/>
+                    </a:xfrm>
+                    <a:prstGeom prst="rect">
+                      <a:avLst/>
+                    </a:prstGeom>
+                    <a:noFill/>
+                    <a:ln>
+                      <a:noFill/>
+                    </a:ln>
+                  </pic:spPr>
+                </pic:pic>
+              </a:graphicData>
+            </a:graphic>
+          </wp:inline>
+        </w:drawing>
+      </w:r>
+    </w:p>
+    <w:p>
+      <w:pPr>
+        <w:shd w:val="clear" w:color="auto" w:fill="FFFFFF" w:themeFill="background1"/>
+        <w:tabs>
+          <w:tab w:val="left" w:pos="3216"/>
+        </w:tabs>
+        <w:spacing w:after="100"/>
+        <w:rPr>
+          <w:b/>
+          <w:bCs/>
+          <w:color w:val="000000" w:themeColor="text1"/>
+          <w:sz w:val="28"/>
+          <w:szCs w:val="28"/>
+        </w:rPr>
+      </w:pPr>
+    </w:p>
+    <w:p>
+      <w:pPr>
+        <w:shd w:val="clear" w:color="auto" w:fill="FFFFFF" w:themeFill="background1"/>
+        <w:spacing w:after="100"/>
+        <w:jc w:val="center"/>
+        <w:rPr>
+          <w:b/>
+          <w:bCs/>
+          <w:color w:val="000000" w:themeColor="text1"/>
+        </w:rPr>
+      </w:pPr>
+      <w:r>
+        <w:rPr>
+          <w:b/>
+          <w:bCs/>
+          <w:color w:val="000000" w:themeColor="text1"/>
+        </w:rPr>
         <w:t>University of the Cumberlands</w:t>
       </w:r>
     </w:p>
     <w:p>
-      <w:pPr/>
-      <w:r>
+      <w:pPr>
+        <w:shd w:val="clear" w:color="auto" w:fill="FFFFFF" w:themeFill="background1"/>
+        <w:spacing w:after="100"/>
+        <w:jc w:val="center"/>
+        <w:rPr>
+          <w:b/>
+          <w:bCs/>
+          <w:color w:val="000000" w:themeColor="text1"/>
+        </w:rPr>
+      </w:pPr>
+      <w:r>
+        <w:rPr>
+          <w:b/>
+          <w:bCs/>
+          <w:color w:val="000000" w:themeColor="text1"/>
+        </w:rPr>
         <w:t>School of Computing and Information Sciences</w:t>
       </w:r>
     </w:p>
     <w:p>
-      <w:pPr/>
-    </w:p>
-    <w:p>
-      <w:pPr/>
-      <w:r>
+      <w:pPr>
+        <w:shd w:val="clear" w:color="auto" w:fill="FFFFFF" w:themeFill="background1"/>
+        <w:spacing w:after="100"/>
+        <w:jc w:val="center"/>
+        <w:rPr>
+          <w:b/>
+          <w:bCs/>
+          <w:color w:val="000000" w:themeColor="text1"/>
+        </w:rPr>
+      </w:pPr>
+    </w:p>
+    <w:p>
+      <w:pPr>
+        <w:shd w:val="clear" w:color="auto" w:fill="FFFFFF" w:themeFill="background1"/>
+        <w:spacing w:after="100"/>
+        <w:jc w:val="center"/>
+        <w:rPr>
+          <w:b/>
+          <w:bCs/>
+          <w:color w:val="000000" w:themeColor="text1"/>
+        </w:rPr>
+      </w:pPr>
+      <w:r>
+        <w:rPr>
+          <w:b/>
+          <w:bCs/>
+          <w:color w:val="000000" w:themeColor="text1"/>
+        </w:rPr>
         <w:t>Certification of Authorship</w:t>
       </w:r>
     </w:p>
     <w:p>
-      <w:pPr/>
-      <w:r>
-        <w:t>Submitted to: Dr. Primus Vekuh</w:t>
-      </w:r>
-    </w:p>
-    <w:p>
-      <w:pPr/>
-      <w:r>
-        <w:t>Course: MSCE-630</w:t>
-      </w:r>
-    </w:p>
-    <w:p>
-      <w:pPr/>
-      <w:r>
-        <w:t>Students’ Name: Abdul Rahim Aamir, Ebubechukwu Ohizu, Gaurab Karki, Rajiv Agrawal</w:t>
-      </w:r>
-    </w:p>
-    <w:p>
-      <w:pPr/>
-      <w:r>
-        <w:t>Date of Submission: 03/28/2026</w:t>
-      </w:r>
-    </w:p>
-    <w:p>
-      <w:pPr/>
-      <w:r>
-        <w:t>Purpose and Title of Submission: Process Scheduling</w:t>
-      </w:r>
-    </w:p>
-    <w:p>
-      <w:pPr/>
-    </w:p>
-    <w:p>
-      <w:pPr/>
-      <w:r>
-        <w:t>Certification of Authorship: I hereby certify that I am the author of this document and that any assistance I received in its preparation is fully acknowledged and disclosed in the document. I have also cited all sources from which I obtained data, ideas, or words that are copied directly or paraphrased in the document. Sources are properly credited according to accepted standards for professional publications. I also certify that this paper was prepared by Group 4 for this purpose.</w:t>
+      <w:pPr>
+        <w:shd w:val="clear" w:color="auto" w:fill="FFFFFF" w:themeFill="background1"/>
+        <w:spacing w:after="100"/>
+        <w:jc w:val="center"/>
+        <w:rPr>
+          <w:color w:val="000000" w:themeColor="text1"/>
+        </w:rPr>
+      </w:pPr>
+      <w:r>
+        <w:rPr>
+          <w:b/>
+          <w:bCs/>
+          <w:color w:val="000000" w:themeColor="text1"/>
+        </w:rPr>
+        <w:t>Submitted to</w:t>
+      </w:r>
+      <w:r>
+        <w:rPr>
+          <w:color w:val="000000" w:themeColor="text1"/>
+        </w:rPr>
+        <w:t xml:space="preserve">: Dr. Primus </w:t>
+      </w:r>
+      <w:proofErr w:type="spellStart"/>
+      <w:r>
+        <w:rPr>
+          <w:color w:val="000000" w:themeColor="text1"/>
+        </w:rPr>
+        <w:t>Vekuh</w:t>
+      </w:r>
+      <w:proofErr w:type="spellEnd"/>
+    </w:p>
+    <w:p>
+      <w:pPr>
+        <w:shd w:val="clear" w:color="auto" w:fill="FFFFFF" w:themeFill="background1"/>
+        <w:spacing w:after="100"/>
+        <w:jc w:val="center"/>
+        <w:rPr>
+          <w:color w:val="000000" w:themeColor="text1"/>
+        </w:rPr>
+      </w:pPr>
+      <w:r>
+        <w:rPr>
+          <w:b/>
+          <w:bCs/>
+          <w:color w:val="000000" w:themeColor="text1"/>
+        </w:rPr>
+        <w:t>Course</w:t>
+      </w:r>
+      <w:r>
+        <w:rPr>
+          <w:color w:val="000000" w:themeColor="text1"/>
+        </w:rPr>
+        <w:t>: MSCE-630</w:t>
+      </w:r>
+    </w:p>
+    <w:p>
+      <w:pPr>
+        <w:shd w:val="clear" w:color="auto" w:fill="FFFFFF" w:themeFill="background1"/>
+        <w:spacing w:after="100"/>
+        <w:jc w:val="center"/>
+        <w:rPr>
+          <w:b/>
+          <w:bCs/>
+          <w:color w:val="000000" w:themeColor="text1"/>
+        </w:rPr>
+      </w:pPr>
+    </w:p>
+    <w:p>
+      <w:pPr>
+        <w:shd w:val="clear" w:color="auto" w:fill="FFFFFF" w:themeFill="background1"/>
+        <w:spacing w:after="100"/>
+        <w:jc w:val="center"/>
+        <w:rPr>
+          <w:color w:val="000000" w:themeColor="text1"/>
+        </w:rPr>
+      </w:pPr>
+      <w:r>
+        <w:rPr>
+          <w:b/>
+          <w:bCs/>
+          <w:color w:val="000000" w:themeColor="text1"/>
+        </w:rPr>
+        <w:t>Students’ Name</w:t>
+      </w:r>
+      <w:r>
+        <w:rPr>
+          <w:b/>
+          <w:bCs/>
+          <w:color w:val="000000" w:themeColor="text1"/>
+        </w:rPr>
+        <w:t>s</w:t>
+      </w:r>
+      <w:r>
+        <w:rPr>
+          <w:color w:val="000000" w:themeColor="text1"/>
+        </w:rPr>
+        <w:t xml:space="preserve">: Abdul Rahim Aamir, Ebubechukwu </w:t>
+      </w:r>
+      <w:proofErr w:type="spellStart"/>
+      <w:r>
+        <w:rPr>
+          <w:color w:val="000000" w:themeColor="text1"/>
+        </w:rPr>
+        <w:t>Ohizu</w:t>
+      </w:r>
+      <w:proofErr w:type="spellEnd"/>
+      <w:r>
+        <w:rPr>
+          <w:color w:val="000000" w:themeColor="text1"/>
+        </w:rPr>
+        <w:t xml:space="preserve">, Gaurab Karki, </w:t>
+      </w:r>
+    </w:p>
+    <w:p>
+      <w:pPr>
+        <w:shd w:val="clear" w:color="auto" w:fill="FFFFFF" w:themeFill="background1"/>
+        <w:spacing w:after="100"/>
+        <w:jc w:val="center"/>
+        <w:rPr>
+          <w:color w:val="000000" w:themeColor="text1"/>
+        </w:rPr>
+      </w:pPr>
+      <w:r>
+        <w:rPr>
+          <w:color w:val="000000" w:themeColor="text1"/>
+        </w:rPr>
+        <w:t>Rajiv</w:t>
+      </w:r>
+      <w:r>
+        <w:rPr>
+          <w:color w:val="000000" w:themeColor="text1"/>
+        </w:rPr>
+        <w:t xml:space="preserve"> </w:t>
+      </w:r>
+      <w:r>
+        <w:rPr>
+          <w:color w:val="000000" w:themeColor="text1"/>
+        </w:rPr>
+        <w:t>Agrawal</w:t>
+      </w:r>
+    </w:p>
+    <w:p>
+      <w:pPr>
+        <w:shd w:val="clear" w:color="auto" w:fill="FFFFFF" w:themeFill="background1"/>
+        <w:spacing w:after="100"/>
+        <w:jc w:val="center"/>
+        <w:rPr>
+          <w:color w:val="000000" w:themeColor="text1"/>
+        </w:rPr>
+      </w:pPr>
+    </w:p>
+    <w:p>
+      <w:pPr>
+        <w:shd w:val="clear" w:color="auto" w:fill="FFFFFF" w:themeFill="background1"/>
+        <w:spacing w:after="100"/>
+        <w:jc w:val="center"/>
+        <w:rPr>
+          <w:color w:val="000000" w:themeColor="text1"/>
+        </w:rPr>
+      </w:pPr>
+      <w:r>
+        <w:rPr>
+          <w:b/>
+          <w:bCs/>
+          <w:color w:val="000000" w:themeColor="text1"/>
+        </w:rPr>
+        <w:t>Date of Submission</w:t>
+      </w:r>
+      <w:r>
+        <w:rPr>
+          <w:color w:val="000000" w:themeColor="text1"/>
+        </w:rPr>
+        <w:t>: 03/28/2026</w:t>
+      </w:r>
+    </w:p>
+    <w:p>
+      <w:pPr>
+        <w:shd w:val="clear" w:color="auto" w:fill="FFFFFF" w:themeFill="background1"/>
+        <w:spacing w:after="100"/>
+        <w:jc w:val="center"/>
+        <w:rPr>
+          <w:color w:val="000000" w:themeColor="text1"/>
+        </w:rPr>
+      </w:pPr>
+    </w:p>
+    <w:p>
+      <w:pPr>
+        <w:shd w:val="clear" w:color="auto" w:fill="FFFFFF" w:themeFill="background1"/>
+        <w:spacing w:after="100"/>
+        <w:jc w:val="center"/>
+        <w:rPr>
+          <w:color w:val="000000" w:themeColor="text1"/>
+        </w:rPr>
+      </w:pPr>
+      <w:r>
+        <w:rPr>
+          <w:b/>
+          <w:bCs/>
+          <w:color w:val="000000" w:themeColor="text1"/>
+        </w:rPr>
+        <w:t>Purpose and Title of Submission</w:t>
+      </w:r>
+      <w:r>
+        <w:rPr>
+          <w:color w:val="000000" w:themeColor="text1"/>
+        </w:rPr>
+        <w:t>: Basic Shell Implementation and Process</w:t>
+      </w:r>
+    </w:p>
+    <w:p>
+      <w:pPr>
+        <w:shd w:val="clear" w:color="auto" w:fill="FFFFFF" w:themeFill="background1"/>
+        <w:spacing w:after="100"/>
+        <w:jc w:val="center"/>
+        <w:rPr>
+          <w:b/>
+          <w:bCs/>
+          <w:color w:val="000000" w:themeColor="text1"/>
+        </w:rPr>
+      </w:pPr>
+    </w:p>
+    <w:p>
+      <w:pPr>
+        <w:shd w:val="clear" w:color="auto" w:fill="FFFFFF" w:themeFill="background1"/>
+        <w:spacing w:after="100"/>
+        <w:jc w:val="center"/>
+        <w:rPr>
+          <w:b/>
+          <w:bCs/>
+          <w:color w:val="000000" w:themeColor="text1"/>
+        </w:rPr>
+      </w:pPr>
+      <w:r>
+        <w:rPr>
+          <w:b/>
+          <w:bCs/>
+          <w:color w:val="000000" w:themeColor="text1"/>
+        </w:rPr>
+        <w:t>Management</w:t>
+      </w:r>
+    </w:p>
+    <w:p>
+      <w:pPr>
+        <w:shd w:val="clear" w:color="auto" w:fill="FFFFFF" w:themeFill="background1"/>
+        <w:spacing w:after="100"/>
+        <w:jc w:val="center"/>
+        <w:rPr>
+          <w:color w:val="000000" w:themeColor="text1"/>
+        </w:rPr>
+      </w:pPr>
+    </w:p>
+    <w:p>
+      <w:pPr>
+        <w:shd w:val="clear" w:color="auto" w:fill="FFFFFF" w:themeFill="background1"/>
+        <w:spacing w:after="100"/>
+        <w:jc w:val="center"/>
+        <w:rPr>
+          <w:color w:val="000000" w:themeColor="text1"/>
+        </w:rPr>
+      </w:pPr>
+      <w:r>
+        <w:rPr>
+          <w:color w:val="000000" w:themeColor="text1"/>
+        </w:rPr>
+        <w:t>Certification of Authorship: I hereby certify that I am the author of this document</w:t>
+      </w:r>
+    </w:p>
+    <w:p>
+      <w:pPr>
+        <w:shd w:val="clear" w:color="auto" w:fill="FFFFFF" w:themeFill="background1"/>
+        <w:spacing w:after="100"/>
+        <w:jc w:val="center"/>
+        <w:rPr>
+          <w:color w:val="000000" w:themeColor="text1"/>
+        </w:rPr>
+      </w:pPr>
+      <w:r>
+        <w:rPr>
+          <w:color w:val="000000" w:themeColor="text1"/>
+        </w:rPr>
+        <w:t>and that any assistance I received in its preparation is fully acknowledged and</w:t>
+      </w:r>
+    </w:p>
+    <w:p>
+      <w:pPr>
+        <w:shd w:val="clear" w:color="auto" w:fill="FFFFFF" w:themeFill="background1"/>
+        <w:spacing w:after="100"/>
+        <w:jc w:val="center"/>
+        <w:rPr>
+          <w:color w:val="000000" w:themeColor="text1"/>
+        </w:rPr>
+      </w:pPr>
+      <w:r>
+        <w:rPr>
+          <w:color w:val="000000" w:themeColor="text1"/>
+        </w:rPr>
+        <w:t>disclosed in the document. I have also cited all sources from which I obtained data,</w:t>
+      </w:r>
+    </w:p>
+    <w:p>
+      <w:pPr>
+        <w:shd w:val="clear" w:color="auto" w:fill="FFFFFF" w:themeFill="background1"/>
+        <w:spacing w:after="100"/>
+        <w:jc w:val="center"/>
+        <w:rPr>
+          <w:color w:val="000000" w:themeColor="text1"/>
+        </w:rPr>
+      </w:pPr>
+      <w:r>
+        <w:rPr>
+          <w:color w:val="000000" w:themeColor="text1"/>
+        </w:rPr>
+        <w:t>ideas, or words that are copied directly or paraphrased in the document. Sources are</w:t>
+      </w:r>
+    </w:p>
+    <w:p>
+      <w:pPr>
+        <w:shd w:val="clear" w:color="auto" w:fill="FFFFFF" w:themeFill="background1"/>
+        <w:spacing w:after="100"/>
+        <w:jc w:val="center"/>
+        <w:rPr>
+          <w:color w:val="000000" w:themeColor="text1"/>
+        </w:rPr>
+      </w:pPr>
+      <w:r>
+        <w:rPr>
+          <w:color w:val="000000" w:themeColor="text1"/>
+        </w:rPr>
+        <w:t>properly credited according to accepted standards for professional publications. I</w:t>
+      </w:r>
+    </w:p>
+    <w:p>
+      <w:pPr>
+        <w:shd w:val="clear" w:color="auto" w:fill="FFFFFF" w:themeFill="background1"/>
+        <w:spacing w:after="100"/>
+        <w:jc w:val="center"/>
+        <w:rPr>
+          <w:color w:val="000000" w:themeColor="text1"/>
+        </w:rPr>
+      </w:pPr>
+      <w:r>
+        <w:rPr>
+          <w:color w:val="000000" w:themeColor="text1"/>
+        </w:rPr>
+        <w:t>also certify that this paper was prepared by Group 4 for this purpose.</w:t>
       </w:r>
     </w:p>
     <w:sectPr>
@@ -1202,10 +3437,10 @@
 <file path=word/numbering.xml><?xml version="1.0" encoding="utf-8"?>
 <w:numbering xmlns:wpc="http://schemas.microsoft.com/office/word/2010/wordprocessingCanvas" xmlns:cx="http://schemas.microsoft.com/office/drawing/2014/chartex" xmlns:cx1="http://schemas.microsoft.com/office/drawing/2015/9/8/chartex" xmlns:cx2="http://schemas.microsoft.com/office/drawing/2015/10/21/chartex" xmlns:cx3="http://schemas.microsoft.com/office/drawing/2016/5/9/chartex" xmlns:cx4="http://schemas.microsoft.com/office/drawing/2016/5/10/chartex" xmlns:cx5="http://schemas.microsoft.com/office/drawing/2016/5/11/chartex" xmlns:cx6="http://schemas.microsoft.com/office/drawing/2016/5/12/chartex" xmlns:cx7="http://schemas.microsoft.com/office/drawing/2016/5/13/chartex" xmlns:cx8="http://schemas.microsoft.com/office/drawing/2016/5/14/chartex" xmlns:mc="http://schemas.openxmlformats.org/markup-compatibility/2006" xmlns:aink="http://schemas.microsoft.com/office/drawing/2016/ink" xmlns:am3d="http://schemas.microsoft.com/office/drawing/2017/model3d" xmlns:o="urn:schemas-microsoft-com:office:office" xmlns:oel="http://schemas.microsoft.com/office/2019/extlst" xmlns:r="http://schemas.openxmlformats.org/officeDocument/2006/relationships" xmlns:m="http://schemas.openxmlformats.org/officeDocument/2006/math" xmlns:v="urn:schemas-microsoft-com:vml" xmlns:wp14="http://schemas.microsoft.com/office/word/2010/wordprocessingDrawing" xmlns:wp="http://schemas.openxmlformats.org/drawingml/2006/wordprocessingDrawing" xmlns:w10="urn:schemas-microsoft-com:office:word" xmlns:w="http://schemas.openxmlformats.org/wordprocessingml/2006/main" xmlns:w14="http://schemas.microsoft.com/office/word/2010/wordml" xmlns:w15="http://schemas.microsoft.com/office/word/2012/wordml" xmlns:w16cex="http://schemas.microsoft.com/office/word/2018/wordml/cex" xmlns:w16cid="http://schemas.microsoft.com/office/word/2016/wordml/cid" xmlns:w16="http://schemas.microsoft.com/office/word/2018/wordml" xmlns:w16du="http://schemas.microsoft.com/office/word/2023/wordml/word16du" xmlns:w16sdtdh="http://schemas.microsoft.com/office/word/2020/wordml/sdtdatahash" xmlns:w16sdtfl="http://schemas.microsoft.com/office/word/2024/wordml/sdtformatlock" xmlns:w16se="http://schemas.microsoft.com/office/word/2015/wordml/symex" xmlns:wpg="http://schemas.microsoft.com/office/word/2010/wordprocessingGroup" xmlns:wpi="http://schemas.microsoft.com/office/word/2010/wordprocessingInk" xmlns:wne="http://schemas.microsoft.com/office/word/2006/wordml" xmlns:wps="http://schemas.microsoft.com/office/word/2010/wordprocessingShape" mc:Ignorable="w14 w15 w16se w16cid w16 w16cex w16sdtdh w16sdtfl w16du wp14">
   <w:abstractNum w:abstractNumId="0" w15:restartNumberingAfterBreak="0">
-    <w:nsid w:val="0ED36C63"/>
+    <w:nsid w:val="3CBF2E4F"/>
     <w:multiLevelType w:val="hybridMultilevel"/>
-    <w:tmpl w:val="B358A63A"/>
-    <w:lvl w:ilvl="0" w:tplc="81CC05AC">
+    <w:tmpl w:val="F89AF074"/>
+    <w:lvl w:ilvl="0" w:tplc="3DA8AB1E">
       <w:start w:val="1"/>
       <w:numFmt w:val="bullet"/>
       <w:lvlText w:val="●"/>
@@ -1214,7 +3449,7 @@
         <w:ind w:left="720" w:hanging="360"/>
       </w:pPr>
     </w:lvl>
-    <w:lvl w:ilvl="1" w:tplc="E13448A4">
+    <w:lvl w:ilvl="1" w:tplc="1B8AC30A">
       <w:start w:val="1"/>
       <w:numFmt w:val="bullet"/>
       <w:lvlText w:val="○"/>
@@ -1223,7 +3458,7 @@
         <w:ind w:left="1440" w:hanging="360"/>
       </w:pPr>
     </w:lvl>
-    <w:lvl w:ilvl="2" w:tplc="23223396">
+    <w:lvl w:ilvl="2" w:tplc="FB70AEF8">
       <w:start w:val="1"/>
       <w:numFmt w:val="bullet"/>
       <w:lvlText w:val="■"/>
@@ -1232,7 +3467,7 @@
         <w:ind w:left="2160" w:hanging="360"/>
       </w:pPr>
     </w:lvl>
-    <w:lvl w:ilvl="3" w:tplc="5FD8573E">
+    <w:lvl w:ilvl="3" w:tplc="F46A15AE">
       <w:start w:val="1"/>
       <w:numFmt w:val="bullet"/>
       <w:lvlText w:val="●"/>
@@ -1241,7 +3476,7 @@
         <w:ind w:left="2880" w:hanging="360"/>
       </w:pPr>
     </w:lvl>
-    <w:lvl w:ilvl="4" w:tplc="70363532">
+    <w:lvl w:ilvl="4" w:tplc="18C6C9A4">
       <w:start w:val="1"/>
       <w:numFmt w:val="bullet"/>
       <w:lvlText w:val="○"/>
@@ -1250,7 +3485,7 @@
         <w:ind w:left="3600" w:hanging="360"/>
       </w:pPr>
     </w:lvl>
-    <w:lvl w:ilvl="5" w:tplc="4304824E">
+    <w:lvl w:ilvl="5" w:tplc="1F0EA2A0">
       <w:start w:val="1"/>
       <w:numFmt w:val="bullet"/>
       <w:lvlText w:val="■"/>
@@ -1259,7 +3494,7 @@
         <w:ind w:left="4320" w:hanging="360"/>
       </w:pPr>
     </w:lvl>
-    <w:lvl w:ilvl="6" w:tplc="7BFE35C2">
+    <w:lvl w:ilvl="6" w:tplc="535A1AE8">
       <w:start w:val="1"/>
       <w:numFmt w:val="bullet"/>
       <w:lvlText w:val="●"/>
@@ -1268,7 +3503,7 @@
         <w:ind w:left="5040" w:hanging="360"/>
       </w:pPr>
     </w:lvl>
-    <w:lvl w:ilvl="7" w:tplc="C1382F06">
+    <w:lvl w:ilvl="7" w:tplc="85DA6986">
       <w:start w:val="1"/>
       <w:numFmt w:val="bullet"/>
       <w:lvlText w:val="●"/>
@@ -1277,7 +3512,7 @@
         <w:ind w:left="5760" w:hanging="360"/>
       </w:pPr>
     </w:lvl>
-    <w:lvl w:ilvl="8" w:tplc="5FEEC7FC">
+    <w:lvl w:ilvl="8" w:tplc="B2F603B8">
       <w:start w:val="1"/>
       <w:numFmt w:val="bullet"/>
       <w:lvlText w:val="●"/>
@@ -1288,20 +3523,20 @@
     </w:lvl>
   </w:abstractNum>
   <w:abstractNum w:abstractNumId="1" w15:restartNumberingAfterBreak="0">
-    <w:nsid w:val="637132DD"/>
+    <w:nsid w:val="69C919F9"/>
     <w:multiLevelType w:val="hybridMultilevel"/>
-    <w:tmpl w:val="1D7C6D82"/>
-    <w:lvl w:ilvl="0" w:tplc="99863620">
+    <w:tmpl w:val="12A47E7C"/>
+    <w:lvl w:ilvl="0" w:tplc="BBAE9C3E">
       <w:start w:val="1"/>
       <w:numFmt w:val="bullet"/>
       <w:suff w:val="space"/>
       <w:lvlText w:val="●"/>
       <w:lvlJc w:val="left"/>
       <w:pPr>
-        <w:ind w:left="240" w:hanging="180"/>
+        <w:ind w:left="180" w:hanging="180"/>
       </w:pPr>
     </w:lvl>
-    <w:lvl w:ilvl="1" w:tplc="B35C5A98">
+    <w:lvl w:ilvl="1" w:tplc="A3404692">
       <w:start w:val="1"/>
       <w:numFmt w:val="bullet"/>
       <w:suff w:val="space"/>
@@ -1311,7 +3546,7 @@
         <w:ind w:left="660" w:hanging="180"/>
       </w:pPr>
     </w:lvl>
-    <w:lvl w:ilvl="2" w:tplc="FF82DA72">
+    <w:lvl w:ilvl="2" w:tplc="C72209FE">
       <w:start w:val="1"/>
       <w:numFmt w:val="bullet"/>
       <w:suff w:val="space"/>
@@ -1321,7 +3556,7 @@
         <w:ind w:left="1080" w:hanging="180"/>
       </w:pPr>
     </w:lvl>
-    <w:lvl w:ilvl="3" w:tplc="EF0AD72A">
+    <w:lvl w:ilvl="3" w:tplc="B94E7AB8">
       <w:start w:val="1"/>
       <w:numFmt w:val="bullet"/>
       <w:suff w:val="space"/>
@@ -1331,7 +3566,7 @@
         <w:ind w:left="1500" w:hanging="180"/>
       </w:pPr>
     </w:lvl>
-    <w:lvl w:ilvl="4" w:tplc="1BC6C2AA">
+    <w:lvl w:ilvl="4" w:tplc="6ECAB3AC">
       <w:start w:val="1"/>
       <w:numFmt w:val="bullet"/>
       <w:suff w:val="space"/>
@@ -1341,7 +3576,7 @@
         <w:ind w:left="1920" w:hanging="180"/>
       </w:pPr>
     </w:lvl>
-    <w:lvl w:ilvl="5" w:tplc="8698E16C">
+    <w:lvl w:ilvl="5" w:tplc="62E0AB44">
       <w:start w:val="1"/>
       <w:numFmt w:val="bullet"/>
       <w:suff w:val="space"/>
@@ -1351,7 +3586,7 @@
         <w:ind w:left="2340" w:hanging="180"/>
       </w:pPr>
     </w:lvl>
-    <w:lvl w:ilvl="6" w:tplc="7EE20196">
+    <w:lvl w:ilvl="6" w:tplc="E4C61BBC">
       <w:start w:val="1"/>
       <w:numFmt w:val="bullet"/>
       <w:suff w:val="space"/>
@@ -1361,7 +3596,7 @@
         <w:ind w:left="2760" w:hanging="180"/>
       </w:pPr>
     </w:lvl>
-    <w:lvl w:ilvl="7" w:tplc="442A79DA">
+    <w:lvl w:ilvl="7" w:tplc="3B0E0BFC">
       <w:start w:val="1"/>
       <w:numFmt w:val="bullet"/>
       <w:suff w:val="space"/>
@@ -1371,7 +3606,7 @@
         <w:ind w:left="3180" w:hanging="180"/>
       </w:pPr>
     </w:lvl>
-    <w:lvl w:ilvl="8" w:tplc="19064C92">
+    <w:lvl w:ilvl="8" w:tplc="47DC1EF8">
       <w:start w:val="1"/>
       <w:numFmt w:val="bullet"/>
       <w:suff w:val="space"/>
@@ -1382,13 +3617,13 @@
       </w:pPr>
     </w:lvl>
   </w:abstractNum>
-  <w:num w:numId="1" w16cid:durableId="1151408150">
+  <w:num w:numId="1" w16cid:durableId="1180317401">
     <w:abstractNumId w:val="0"/>
     <w:lvlOverride w:ilvl="0">
       <w:startOverride w:val="1"/>
     </w:lvlOverride>
   </w:num>
-  <w:num w:numId="2" w16cid:durableId="112139627">
+  <w:num w:numId="2" w16cid:durableId="674765964">
     <w:abstractNumId w:val="1"/>
     <w:lvlOverride w:ilvl="0">
       <w:startOverride w:val="1"/>
@@ -1405,10 +3640,14 @@
         <w:rFonts w:ascii="Times New Roman" w:eastAsia="Times New Roman" w:hAnsi="Times New Roman" w:cs="Times New Roman"/>
         <w:sz w:val="24"/>
         <w:szCs w:val="24"/>
-        <w:lang w:val="en-US" w:eastAsia="en-US" w:bidi="ar-SA"/>
+        <w:lang w:val="en-IN" w:eastAsia="en-IN" w:bidi="ar-SA"/>
       </w:rPr>
     </w:rPrDefault>
-    <w:pPrDefault/>
+    <w:pPrDefault>
+      <w:pPr>
+        <w:spacing w:after="160" w:line="278" w:lineRule="auto"/>
+      </w:pPr>
+    </w:pPrDefault>
   </w:docDefaults>
   <w:latentStyles w:defLockedState="0" w:defUIPriority="99" w:defSemiHidden="0" w:defUnhideWhenUsed="0" w:defQFormat="0" w:count="376">
     <w:lsdException w:name="Normal" w:uiPriority="0" w:qFormat="1"/>
@@ -1891,7 +4130,6 @@
   <w:style w:type="character" w:default="1" w:styleId="DefaultParagraphFont">
     <w:name w:val="Default Paragraph Font"/>
     <w:uiPriority w:val="1"/>
-    <w:semiHidden/>
     <w:unhideWhenUsed/>
   </w:style>
   <w:style w:type="table" w:default="1" w:styleId="TableNormal">
@@ -1960,6 +4198,9 @@
     <w:uiPriority w:val="99"/>
     <w:semiHidden/>
     <w:unhideWhenUsed/>
+    <w:pPr>
+      <w:spacing w:after="0" w:line="240" w:lineRule="auto"/>
+    </w:pPr>
     <w:rPr>
       <w:sz w:val="20"/>
       <w:szCs w:val="20"/>
@@ -1976,36 +4217,6 @@
       <w:szCs w:val="20"/>
     </w:rPr>
   </w:style>
-  <w:style w:type="character" w:styleId="Strong">
-    <w:name w:val="Strong"/>
-    <w:basedOn w:val="DefaultParagraphFont"/>
-    <w:uiPriority w:val="22"/>
-    <w:qFormat/>
-    <w:rsid w:val="003E6F40"/>
-    <w:rPr>
-      <w:b/>
-      <w:bCs/>
-    </w:rPr>
-  </w:style>
-  <w:style w:type="paragraph" w:styleId="Caption">
-    <w:name w:val="caption"/>
-    <w:basedOn w:val="Normal"/>
-    <w:next w:val="Normal"/>
-    <w:uiPriority w:val="35"/>
-    <w:unhideWhenUsed/>
-    <w:qFormat/>
-    <w:rsid w:val="009649D7"/>
-    <w:pPr>
-      <w:spacing w:after="200"/>
-    </w:pPr>
-    <w:rPr>
-      <w:i/>
-      <w:iCs/>
-      <w:color w:val="0E2841" w:themeColor="text2"/>
-      <w:sz w:val="18"/>
-      <w:szCs w:val="18"/>
-    </w:rPr>
-  </w:style>
 </w:styles>
 </file>
 
@@ -2020,39 +4231,39 @@
         <a:sysClr val="window" lastClr="FFFFFF"/>
       </a:lt1>
       <a:dk2>
-        <a:srgbClr val="0E2841"/>
+        <a:srgbClr val="44546A"/>
       </a:dk2>
       <a:lt2>
-        <a:srgbClr val="E8E8E8"/>
+        <a:srgbClr val="E7E6E6"/>
       </a:lt2>
       <a:accent1>
-        <a:srgbClr val="156082"/>
+        <a:srgbClr val="4472C4"/>
       </a:accent1>
       <a:accent2>
-        <a:srgbClr val="E97132"/>
+        <a:srgbClr val="ED7D31"/>
       </a:accent2>
       <a:accent3>
-        <a:srgbClr val="196B24"/>
+        <a:srgbClr val="A5A5A5"/>
       </a:accent3>
       <a:accent4>
-        <a:srgbClr val="0F9ED5"/>
+        <a:srgbClr val="FFC000"/>
       </a:accent4>
       <a:accent5>
-        <a:srgbClr val="A02B93"/>
+        <a:srgbClr val="5B9BD5"/>
       </a:accent5>
       <a:accent6>
-        <a:srgbClr val="4EA72E"/>
+        <a:srgbClr val="70AD47"/>
       </a:accent6>
       <a:hlink>
-        <a:srgbClr val="467886"/>
+        <a:srgbClr val="0563C1"/>
       </a:hlink>
       <a:folHlink>
-        <a:srgbClr val="96607D"/>
+        <a:srgbClr val="954F72"/>
       </a:folHlink>
     </a:clrScheme>
     <a:fontScheme name="Office">
       <a:majorFont>
-        <a:latin typeface="Aptos Display" panose="02110004020202020204"/>
+        <a:latin typeface="Calibri Light" panose="020F0302020204030204"/>
         <a:ea typeface=""/>
         <a:cs typeface=""/>
         <a:font script="Jpan" typeface="游ゴシック Light"/>
@@ -2104,7 +4315,7 @@
         <a:font script="Tfng" typeface="Ebrima"/>
       </a:majorFont>
       <a:minorFont>
-        <a:latin typeface="Aptos" panose="02110004020202020204"/>
+        <a:latin typeface="Calibri" panose="020F0502020204030204"/>
         <a:ea typeface=""/>
         <a:cs typeface=""/>
         <a:font script="Jpan" typeface="游明朝"/>
@@ -2215,6 +4426,13 @@
         </a:gradFill>
       </a:fillStyleLst>
       <a:lnStyleLst>
+        <a:ln w="6350" cap="flat" cmpd="sng" algn="ctr">
+          <a:solidFill>
+            <a:schemeClr val="phClr"/>
+          </a:solidFill>
+          <a:prstDash val="solid"/>
+          <a:miter lim="800000"/>
+        </a:ln>
         <a:ln w="12700" cap="flat" cmpd="sng" algn="ctr">
           <a:solidFill>
             <a:schemeClr val="phClr"/>
@@ -2223,13 +4441,6 @@
           <a:miter lim="800000"/>
         </a:ln>
         <a:ln w="19050" cap="flat" cmpd="sng" algn="ctr">
-          <a:solidFill>
-            <a:schemeClr val="phClr"/>
-          </a:solidFill>
-          <a:prstDash val="solid"/>
-          <a:miter lim="800000"/>
-        </a:ln>
-        <a:ln w="25400" cap="flat" cmpd="sng" algn="ctr">
           <a:solidFill>
             <a:schemeClr val="phClr"/>
           </a:solidFill>
@@ -2294,32 +4505,24 @@
       </a:bgFillStyleLst>
     </a:fmtScheme>
   </a:themeElements>
-  <a:objectDefaults>
-    <a:lnDef>
-      <a:spPr/>
-      <a:bodyPr/>
-      <a:lstStyle/>
-      <a:style>
-        <a:lnRef idx="2">
-          <a:schemeClr val="accent1"/>
-        </a:lnRef>
-        <a:fillRef idx="0">
-          <a:schemeClr val="accent1"/>
-        </a:fillRef>
-        <a:effectRef idx="1">
-          <a:schemeClr val="accent1"/>
-        </a:effectRef>
-        <a:fontRef idx="minor">
-          <a:schemeClr val="tx1"/>
-        </a:fontRef>
-      </a:style>
-    </a:lnDef>
-  </a:objectDefaults>
+  <a:objectDefaults/>
   <a:extraClrSchemeLst/>
   <a:extLst>
     <a:ext uri="{05A4C25C-085E-4340-85A3-A5531E510DB2}">
-      <thm15:themeFamily xmlns:thm15="http://schemas.microsoft.com/office/thememl/2012/main" name="Office Theme" id="{2E142A2C-CD16-42D6-873A-C26D2A0506FA}" vid="{1BDDFF52-6CD6-40A5-AB3C-68EB2F1E4D0A}"/>
+      <thm15:themeFamily xmlns:thm15="http://schemas.microsoft.com/office/thememl/2012/main" name="Office Theme" id="{62F939B6-93AF-4DB8-9C6B-D6C7DFDC589F}" vid="{4A3C46E8-61CC-4603-A589-7422A47A8E4A}"/>
     </a:ext>
   </a:extLst>
 </a:theme>
+</file>
+
+<file path=customXml/item1.xml><?xml version="1.0" encoding="utf-8"?>
+<b:Sources xmlns:b="http://schemas.openxmlformats.org/officeDocument/2006/bibliography" xmlns="http://schemas.openxmlformats.org/officeDocument/2006/bibliography" SelectedStyle="\APASixthEditionOfficeOnline.xsl" StyleName="APA" Version="6"/>
+</file>
+
+<file path=customXml/itemProps1.xml><?xml version="1.0" encoding="utf-8"?>
+<ds:datastoreItem xmlns:ds="http://schemas.openxmlformats.org/officeDocument/2006/customXml" ds:itemID="{5E405575-8588-49E6-A2E1-AE1B94E7C4AB}">
+  <ds:schemaRefs>
+    <ds:schemaRef ds:uri="http://schemas.openxmlformats.org/officeDocument/2006/bibliography"/>
+  </ds:schemaRefs>
+</ds:datastoreItem>
 </file>
</xml_diff>

<commit_message>
Fix: explicit bold on all Strong1 headings in D2/D3/D4
</commit_message>
<xml_diff>
--- a/deliverables/deliverable2/Group 4 AOS Report Deliverable 2.docx
+++ b/deliverables/deliverable2/Group 4 AOS Report Deliverable 2.docx
@@ -194,6 +194,9 @@
         <w:jc w:val="center"/>
       </w:pPr>
       <w:r>
+        <w:rPr>
+          <w:b/>
+        </w:rPr>
         <w:t>Process Scheduling</w:t>
       </w:r>
     </w:p>
@@ -204,6 +207,9 @@
         <w:jc w:val="both"/>
       </w:pPr>
       <w:r>
+        <w:rPr>
+          <w:b/>
+        </w:rPr>
         <w:t>1. Scheduling Algorithms</w:t>
       </w:r>
     </w:p>
@@ -214,6 +220,9 @@
         <w:jc w:val="both"/>
       </w:pPr>
       <w:r>
+        <w:rPr>
+          <w:b/>
+        </w:rPr>
         <w:t>Round-Robin Scheduling</w:t>
       </w:r>
     </w:p>
@@ -288,6 +297,9 @@
         <w:jc w:val="both"/>
       </w:pPr>
       <w:r>
+        <w:rPr>
+          <w:b/>
+        </w:rPr>
         <w:t>Priority-Based Scheduling</w:t>
       </w:r>
     </w:p>
@@ -374,6 +386,9 @@
         <w:jc w:val="both"/>
       </w:pPr>
       <w:r>
+        <w:rPr>
+          <w:b/>
+        </w:rPr>
         <w:t>2. Performance Analysis</w:t>
       </w:r>
     </w:p>
@@ -384,6 +399,9 @@
         <w:jc w:val="both"/>
       </w:pPr>
       <w:r>
+        <w:rPr>
+          <w:b/>
+        </w:rPr>
         <w:t>Round-Robin Sample Run (quantum = 2s)</w:t>
       </w:r>
     </w:p>
@@ -907,6 +925,9 @@
         <w:jc w:val="both"/>
       </w:pPr>
       <w:r>
+        <w:rPr>
+          <w:b/>
+        </w:rPr>
         <w:t>Priority Sample Run</w:t>
       </w:r>
     </w:p>
@@ -996,6 +1017,9 @@
         <w:jc w:val="both"/>
       </w:pPr>
       <w:r>
+        <w:rPr>
+          <w:b/>
+        </w:rPr>
         <w:t>3. Challenges and Improvements</w:t>
       </w:r>
     </w:p>
@@ -1006,6 +1030,9 @@
         <w:jc w:val="both"/>
       </w:pPr>
       <w:r>
+        <w:rPr>
+          <w:b/>
+        </w:rPr>
         <w:t>Challenge 1 — Simulated vs Real Clock</w:t>
       </w:r>
     </w:p>
@@ -1032,6 +1059,9 @@
         <w:jc w:val="both"/>
       </w:pPr>
       <w:r>
+        <w:rPr>
+          <w:b/>
+        </w:rPr>
         <w:t>Challenge 2 — Preemption Granularity</w:t>
       </w:r>
     </w:p>
@@ -1058,6 +1088,9 @@
         <w:jc w:val="both"/>
       </w:pPr>
       <w:r>
+        <w:rPr>
+          <w:b/>
+        </w:rPr>
         <w:t>Challenge 3 — Thread Safety</w:t>
       </w:r>
     </w:p>
@@ -1076,6 +1109,9 @@
         <w:jc w:val="both"/>
       </w:pPr>
       <w:r>
+        <w:rPr>
+          <w:b/>
+        </w:rPr>
         <w:t>Possible Improvements</w:t>
       </w:r>
     </w:p>
@@ -1130,6 +1166,9 @@
         <w:jc w:val="both"/>
       </w:pPr>
       <w:r>
+        <w:rPr>
+          <w:b/>
+        </w:rPr>
         <w:t>4. Screenshots</w:t>
       </w:r>
     </w:p>

</xml_diff>